<commit_message>
Notas al pie y tablas sombreadas en todos los temas revisados (Víctor, 20/10/2026)
- Nota que sigue en la página siguiente: flecha morada en el margen al final
  del trozo que queda en la primera (tcee.sty, en \@makecol).
- Nota con gráfico (\graficonota): ya no se parte entre 2 páginas (3.A.12 y
  3.A.17 dejaban el texto en una y el gráfico en otra).
- 3.A.18: la demanda discontinua con costes lineales sale de la nota y es el
  panel c del gráfico de Hotelling con costes lineales (anexo D).
- Matrices de pagos y tablas con \cellcolor (3.A.8, 3.A.9 y 3.A.14): \hhline en
  vez de \cline, para que el sombreado no tape los bordes; la tabla de la
  gallina, con columnas tan anchas como su cabecera.
- CRITERIOS.md: las 3 reglas. Reconstruidos los 13 temas revisados.

Co-Authored-By: Claude Opus 5.5 <noreply@anthropic.com>
Claude-Session: https://claude.ai/code/session_01PWJgAjs4PN1Rvp3aLA4tqT
</commit_message>
<xml_diff>
--- a/oposicion/temario/tercer-ejercicio/3A10.docx
+++ b/oposicion/temario/tercer-ejercicio/3A10.docx
@@ -70387,7 +70387,7 @@
       <w:jc w:val="both"/>
     </w:pPr>
     <w:rPr>
-      <w:rFonts w:ascii="Palatino Linotype" w:cs="Palatino Linotype" w:eastAsia="Palatino Linotype" w:hAnsi="Palatino Linotype"/>
+      <w:rFonts w:ascii="TeX Gyre Pagella" w:cs="TeX Gyre Pagella" w:eastAsia="TeX Gyre Pagella" w:hAnsi="TeX Gyre Pagella"/>
       <w:sz w:val="22"/>
     </w:rPr>
   </w:style>
@@ -70402,7 +70402,7 @@
       <w:jc w:val="both"/>
     </w:pPr>
     <w:rPr>
-      <w:rFonts w:ascii="Palatino Linotype" w:cs="Palatino Linotype" w:eastAsia="Palatino Linotype" w:hAnsi="Palatino Linotype"/>
+      <w:rFonts w:ascii="TeX Gyre Pagella" w:cs="TeX Gyre Pagella" w:eastAsia="TeX Gyre Pagella" w:hAnsi="TeX Gyre Pagella"/>
       <w:sz w:val="22"/>
     </w:rPr>
   </w:style>
@@ -70417,7 +70417,7 @@
       <w:jc w:val="both"/>
     </w:pPr>
     <w:rPr>
-      <w:rFonts w:ascii="Palatino Linotype" w:cs="Palatino Linotype" w:eastAsia="Palatino Linotype" w:hAnsi="Palatino Linotype"/>
+      <w:rFonts w:ascii="TeX Gyre Pagella" w:cs="TeX Gyre Pagella" w:eastAsia="TeX Gyre Pagella" w:hAnsi="TeX Gyre Pagella"/>
       <w:sz w:val="22"/>
     </w:rPr>
   </w:style>
@@ -70431,7 +70431,7 @@
       <w:jc w:val="both"/>
     </w:pPr>
     <w:rPr>
-      <w:rFonts w:ascii="Palatino Linotype" w:cs="Palatino Linotype" w:eastAsia="Palatino Linotype" w:hAnsi="Palatino Linotype"/>
+      <w:rFonts w:ascii="TeX Gyre Pagella" w:cs="TeX Gyre Pagella" w:eastAsia="TeX Gyre Pagella" w:hAnsi="TeX Gyre Pagella"/>
       <w:sz w:val="22"/>
     </w:rPr>
   </w:style>
@@ -70451,7 +70451,7 @@
       <w:jc w:val="center"/>
     </w:pPr>
     <w:rPr>
-      <w:rFonts w:ascii="Palatino Linotype" w:cs="Palatino Linotype" w:eastAsia="Palatino Linotype" w:hAnsi="Palatino Linotype"/>
+      <w:rFonts w:ascii="TeX Gyre Pagella" w:cs="TeX Gyre Pagella" w:eastAsia="TeX Gyre Pagella" w:hAnsi="TeX Gyre Pagella"/>
       <w:b/>
       <w:caps/>
       <w:color w:val="5F2987"/>
@@ -70486,7 +70486,7 @@
       <w:jc w:val="center"/>
     </w:pPr>
     <w:rPr>
-      <w:rFonts w:ascii="Palatino Linotype" w:cs="Palatino Linotype" w:eastAsia="Palatino Linotype" w:hAnsi="Palatino Linotype"/>
+      <w:rFonts w:ascii="TeX Gyre Pagella" w:cs="TeX Gyre Pagella" w:eastAsia="TeX Gyre Pagella" w:hAnsi="TeX Gyre Pagella"/>
       <w:b w:val="0"/>
       <w:i/>
       <w:caps w:val="0"/>
@@ -70521,7 +70521,7 @@
       <w:jc w:val="center"/>
     </w:pPr>
     <w:rPr>
-      <w:rFonts w:ascii="Palatino Linotype" w:cs="Palatino Linotype" w:eastAsia="Palatino Linotype" w:hAnsi="Palatino Linotype"/>
+      <w:rFonts w:ascii="TeX Gyre Pagella" w:cs="TeX Gyre Pagella" w:eastAsia="TeX Gyre Pagella" w:hAnsi="TeX Gyre Pagella"/>
       <w:b w:val="0"/>
       <w:i/>
       <w:caps w:val="0"/>
@@ -70542,7 +70542,7 @@
       <w:jc w:val="center"/>
     </w:pPr>
     <w:rPr>
-      <w:rFonts w:ascii="Palatino Linotype" w:cs="Palatino Linotype" w:eastAsia="Palatino Linotype" w:hAnsi="Palatino Linotype"/>
+      <w:rFonts w:ascii="TeX Gyre Pagella" w:cs="TeX Gyre Pagella" w:eastAsia="TeX Gyre Pagella" w:hAnsi="TeX Gyre Pagella"/>
       <w:b w:val="0"/>
       <w:i/>
       <w:caps w:val="0"/>
@@ -70590,7 +70590,7 @@
     <w:qFormat/>
     <w:pPr/>
     <w:rPr>
-      <w:rFonts w:ascii="Palatino Linotype" w:cs="Palatino Linotype" w:eastAsia="Palatino Linotype" w:hAnsi="Palatino Linotype"/>
+      <w:rFonts w:ascii="TeX Gyre Pagella" w:cs="TeX Gyre Pagella" w:eastAsia="TeX Gyre Pagella" w:hAnsi="TeX Gyre Pagella"/>
       <w:sz w:val="20"/>
     </w:rPr>
   </w:style>
@@ -70610,7 +70610,7 @@
       <w:shd w:color="auto" w:fill="5F2987" w:val="clear"/>
     </w:pPr>
     <w:rPr>
-      <w:rFonts w:ascii="Palatino Linotype" w:cs="Palatino Linotype" w:eastAsia="Palatino Linotype" w:hAnsi="Palatino Linotype"/>
+      <w:rFonts w:ascii="TeX Gyre Pagella" w:cs="TeX Gyre Pagella" w:eastAsia="TeX Gyre Pagella" w:hAnsi="TeX Gyre Pagella"/>
       <w:b/>
       <w:caps/>
       <w:color w:val="FFFFFF"/>
@@ -70638,7 +70638,7 @@
       </w:pBdr>
     </w:pPr>
     <w:rPr>
-      <w:rFonts w:ascii="Palatino Linotype" w:cs="Palatino Linotype" w:eastAsia="Palatino Linotype" w:hAnsi="Palatino Linotype"/>
+      <w:rFonts w:ascii="TeX Gyre Pagella" w:cs="TeX Gyre Pagella" w:eastAsia="TeX Gyre Pagella" w:hAnsi="TeX Gyre Pagella"/>
       <w:b/>
       <w:caps w:val="0"/>
       <w:color w:val="5F2987"/>
@@ -70664,7 +70664,7 @@
       <w:outlineLvl w:val="2"/>
     </w:pPr>
     <w:rPr>
-      <w:rFonts w:ascii="Palatino Linotype" w:cs="Palatino Linotype" w:eastAsia="Palatino Linotype" w:hAnsi="Palatino Linotype"/>
+      <w:rFonts w:ascii="TeX Gyre Pagella" w:cs="TeX Gyre Pagella" w:eastAsia="TeX Gyre Pagella" w:hAnsi="TeX Gyre Pagella"/>
       <w:b w:val="0"/>
       <w:i/>
       <w:color w:val="5F2987"/>
@@ -70690,7 +70690,7 @@
       <w:outlineLvl w:val="3"/>
     </w:pPr>
     <w:rPr>
-      <w:rFonts w:ascii="Palatino Linotype" w:cs="Palatino Linotype" w:eastAsia="Palatino Linotype" w:hAnsi="Palatino Linotype"/>
+      <w:rFonts w:ascii="TeX Gyre Pagella" w:cs="TeX Gyre Pagella" w:eastAsia="TeX Gyre Pagella" w:hAnsi="TeX Gyre Pagella"/>
       <w:b w:val="0"/>
       <w:i/>
       <w:iCs/>
@@ -70716,7 +70716,7 @@
       <w:outlineLvl w:val="4"/>
     </w:pPr>
     <w:rPr>
-      <w:rFonts w:ascii="Palatino Linotype" w:cs="Palatino Linotype" w:eastAsia="Palatino Linotype" w:hAnsi="Palatino Linotype"/>
+      <w:rFonts w:ascii="TeX Gyre Pagella" w:cs="TeX Gyre Pagella" w:eastAsia="TeX Gyre Pagella" w:hAnsi="TeX Gyre Pagella"/>
       <w:b w:val="0"/>
       <w:i/>
       <w:color w:val="4A1F6B"/>
@@ -70741,7 +70741,7 @@
       <w:outlineLvl w:val="5"/>
     </w:pPr>
     <w:rPr>
-      <w:rFonts w:ascii="Palatino Linotype" w:cs="Palatino Linotype" w:eastAsia="Palatino Linotype" w:hAnsi="Palatino Linotype"/>
+      <w:rFonts w:ascii="TeX Gyre Pagella" w:cs="TeX Gyre Pagella" w:eastAsia="TeX Gyre Pagella" w:hAnsi="TeX Gyre Pagella"/>
       <w:b w:val="0"/>
       <w:i/>
       <w:iCs/>
@@ -70953,7 +70953,7 @@
     <w:unhideWhenUsed/>
     <w:qFormat/>
     <w:rPr>
-      <w:rFonts w:ascii="Palatino Linotype" w:cs="Palatino Linotype" w:eastAsia="Palatino Linotype" w:hAnsi="Palatino Linotype"/>
+      <w:rFonts w:ascii="TeX Gyre Pagella" w:cs="TeX Gyre Pagella" w:eastAsia="TeX Gyre Pagella" w:hAnsi="TeX Gyre Pagella"/>
       <w:sz w:val="18"/>
     </w:rPr>
   </w:style>
@@ -71040,7 +71040,7 @@
       <w:jc w:val="center"/>
     </w:pPr>
     <w:rPr>
-      <w:rFonts w:ascii="Palatino Linotype" w:cs="Palatino Linotype" w:eastAsia="Palatino Linotype" w:hAnsi="Palatino Linotype"/>
+      <w:rFonts w:ascii="TeX Gyre Pagella" w:cs="TeX Gyre Pagella" w:eastAsia="TeX Gyre Pagella" w:hAnsi="TeX Gyre Pagella"/>
       <w:b w:val="0"/>
       <w:i w:val="0"/>
       <w:color w:val="5F2987"/>
@@ -71055,7 +71055,7 @@
       <w:jc w:val="center"/>
     </w:pPr>
     <w:rPr>
-      <w:rFonts w:ascii="Palatino Linotype" w:cs="Palatino Linotype" w:eastAsia="Palatino Linotype" w:hAnsi="Palatino Linotype"/>
+      <w:rFonts w:ascii="TeX Gyre Pagella" w:cs="TeX Gyre Pagella" w:eastAsia="TeX Gyre Pagella" w:hAnsi="TeX Gyre Pagella"/>
       <w:b w:val="0"/>
       <w:i w:val="0"/>
       <w:color w:val="5F2987"/>
@@ -71070,7 +71070,7 @@
       <w:jc w:val="center"/>
     </w:pPr>
     <w:rPr>
-      <w:rFonts w:ascii="Palatino Linotype" w:cs="Palatino Linotype" w:eastAsia="Palatino Linotype" w:hAnsi="Palatino Linotype"/>
+      <w:rFonts w:ascii="TeX Gyre Pagella" w:cs="TeX Gyre Pagella" w:eastAsia="TeX Gyre Pagella" w:hAnsi="TeX Gyre Pagella"/>
       <w:b w:val="0"/>
       <w:i w:val="0"/>
       <w:color w:val="5F2987"/>
@@ -71153,7 +71153,7 @@
       <w:shd w:color="auto" w:fill="F3EEF7" w:val="clear"/>
     </w:pPr>
     <w:rPr>
-      <w:rFonts w:ascii="Palatino Linotype" w:cs="Palatino Linotype" w:eastAsia="Palatino Linotype" w:hAnsi="Palatino Linotype"/>
+      <w:rFonts w:ascii="TeX Gyre Pagella" w:cs="TeX Gyre Pagella" w:eastAsia="TeX Gyre Pagella" w:hAnsi="TeX Gyre Pagella"/>
       <w:sz w:val="19"/>
     </w:rPr>
   </w:style>
@@ -71171,7 +71171,7 @@
       <w:shd w:color="auto" w:fill="E7E6E6" w:val="clear"/>
     </w:pPr>
     <w:rPr>
-      <w:rFonts w:ascii="Palatino Linotype" w:cs="Palatino Linotype" w:eastAsia="Palatino Linotype" w:hAnsi="Palatino Linotype"/>
+      <w:rFonts w:ascii="TeX Gyre Pagella" w:cs="TeX Gyre Pagella" w:eastAsia="TeX Gyre Pagella" w:hAnsi="TeX Gyre Pagella"/>
       <w:sz w:val="18"/>
     </w:rPr>
   </w:style>
@@ -71189,7 +71189,7 @@
       <w:shd w:color="auto" w:fill="E2EFD9" w:val="clear"/>
     </w:pPr>
     <w:rPr>
-      <w:rFonts w:ascii="Palatino Linotype" w:cs="Palatino Linotype" w:eastAsia="Palatino Linotype" w:hAnsi="Palatino Linotype"/>
+      <w:rFonts w:ascii="TeX Gyre Pagella" w:cs="TeX Gyre Pagella" w:eastAsia="TeX Gyre Pagella" w:hAnsi="TeX Gyre Pagella"/>
       <w:i/>
       <w:sz w:val="22"/>
     </w:rPr>
@@ -71208,7 +71208,7 @@
       <w:shd w:color="auto" w:fill="FAF9F6" w:val="clear"/>
     </w:pPr>
     <w:rPr>
-      <w:rFonts w:ascii="Palatino Linotype" w:cs="Palatino Linotype" w:eastAsia="Palatino Linotype" w:hAnsi="Palatino Linotype"/>
+      <w:rFonts w:ascii="TeX Gyre Pagella" w:cs="TeX Gyre Pagella" w:eastAsia="TeX Gyre Pagella" w:hAnsi="TeX Gyre Pagella"/>
       <w:sz w:val="20"/>
     </w:rPr>
   </w:style>
@@ -71220,7 +71220,7 @@
       <w:jc w:val="center"/>
     </w:pPr>
     <w:rPr>
-      <w:rFonts w:ascii="Palatino Linotype" w:cs="Palatino Linotype" w:eastAsia="Palatino Linotype" w:hAnsi="Palatino Linotype"/>
+      <w:rFonts w:ascii="TeX Gyre Pagella" w:cs="TeX Gyre Pagella" w:eastAsia="TeX Gyre Pagella" w:hAnsi="TeX Gyre Pagella"/>
       <w:i/>
       <w:color w:val="3B3838"/>
       <w:sz w:val="16"/>
@@ -71243,7 +71243,7 @@
       <w:shd w:color="auto" w:fill="F7F3FA" w:val="clear"/>
     </w:pPr>
     <w:rPr>
-      <w:rFonts w:ascii="Palatino Linotype" w:cs="Palatino Linotype" w:eastAsia="Palatino Linotype" w:hAnsi="Palatino Linotype"/>
+      <w:rFonts w:ascii="TeX Gyre Pagella" w:cs="TeX Gyre Pagella" w:eastAsia="TeX Gyre Pagella" w:hAnsi="TeX Gyre Pagella"/>
       <w:color w:val="5F2987"/>
       <w:sz w:val="22"/>
     </w:rPr>
@@ -71265,7 +71265,7 @@
       <w:jc w:val="center"/>
     </w:pPr>
     <w:rPr>
-      <w:rFonts w:ascii="Palatino Linotype" w:cs="Palatino Linotype" w:eastAsia="Palatino Linotype" w:hAnsi="Palatino Linotype"/>
+      <w:rFonts w:ascii="TeX Gyre Pagella" w:cs="TeX Gyre Pagella" w:eastAsia="TeX Gyre Pagella" w:hAnsi="TeX Gyre Pagella"/>
       <w:i/>
       <w:color w:val="767171"/>
       <w:sz w:val="18"/>
@@ -71296,7 +71296,7 @@
       <w:shd w:color="auto" w:fill="E2EFD9" w:val="clear"/>
     </w:pPr>
     <w:rPr>
-      <w:rFonts w:ascii="Palatino Linotype" w:cs="Palatino Linotype" w:eastAsia="Palatino Linotype" w:hAnsi="Palatino Linotype"/>
+      <w:rFonts w:ascii="TeX Gyre Pagella" w:cs="TeX Gyre Pagella" w:eastAsia="TeX Gyre Pagella" w:hAnsi="TeX Gyre Pagella"/>
       <w:sz w:val="20"/>
     </w:rPr>
   </w:style>
@@ -71310,7 +71310,7 @@
       <w:shd w:color="auto" w:fill="DDEBF7" w:val="clear"/>
     </w:pPr>
     <w:rPr>
-      <w:rFonts w:ascii="Palatino Linotype" w:cs="Palatino Linotype" w:eastAsia="Palatino Linotype" w:hAnsi="Palatino Linotype"/>
+      <w:rFonts w:ascii="TeX Gyre Pagella" w:cs="TeX Gyre Pagella" w:eastAsia="TeX Gyre Pagella" w:hAnsi="TeX Gyre Pagella"/>
       <w:sz w:val="20"/>
     </w:rPr>
   </w:style>
@@ -71324,7 +71324,7 @@
       <w:shd w:color="auto" w:fill="FBE4D5" w:val="clear"/>
     </w:pPr>
     <w:rPr>
-      <w:rFonts w:ascii="Palatino Linotype" w:cs="Palatino Linotype" w:eastAsia="Palatino Linotype" w:hAnsi="Palatino Linotype"/>
+      <w:rFonts w:ascii="TeX Gyre Pagella" w:cs="TeX Gyre Pagella" w:eastAsia="TeX Gyre Pagella" w:hAnsi="TeX Gyre Pagella"/>
       <w:sz w:val="20"/>
     </w:rPr>
   </w:style>
@@ -71338,7 +71338,7 @@
       <w:shd w:color="auto" w:fill="F3EEF7" w:val="clear"/>
     </w:pPr>
     <w:rPr>
-      <w:rFonts w:ascii="Palatino Linotype" w:cs="Palatino Linotype" w:eastAsia="Palatino Linotype" w:hAnsi="Palatino Linotype"/>
+      <w:rFonts w:ascii="TeX Gyre Pagella" w:cs="TeX Gyre Pagella" w:eastAsia="TeX Gyre Pagella" w:hAnsi="TeX Gyre Pagella"/>
       <w:sz w:val="20"/>
     </w:rPr>
   </w:style>
@@ -71352,7 +71352,7 @@
       <w:shd w:color="auto" w:fill="E7E6E6" w:val="clear"/>
     </w:pPr>
     <w:rPr>
-      <w:rFonts w:ascii="Palatino Linotype" w:cs="Palatino Linotype" w:eastAsia="Palatino Linotype" w:hAnsi="Palatino Linotype"/>
+      <w:rFonts w:ascii="TeX Gyre Pagella" w:cs="TeX Gyre Pagella" w:eastAsia="TeX Gyre Pagella" w:hAnsi="TeX Gyre Pagella"/>
       <w:sz w:val="20"/>
     </w:rPr>
   </w:style>
@@ -71366,7 +71366,7 @@
       <w:shd w:color="auto" w:fill="FAF9F6" w:val="clear"/>
     </w:pPr>
     <w:rPr>
-      <w:rFonts w:ascii="Palatino Linotype" w:cs="Palatino Linotype" w:eastAsia="Palatino Linotype" w:hAnsi="Palatino Linotype"/>
+      <w:rFonts w:ascii="TeX Gyre Pagella" w:cs="TeX Gyre Pagella" w:eastAsia="TeX Gyre Pagella" w:hAnsi="TeX Gyre Pagella"/>
       <w:sz w:val="20"/>
     </w:rPr>
   </w:style>
@@ -71380,7 +71380,7 @@
       <w:shd w:color="auto" w:fill="5F2987" w:val="clear"/>
     </w:pPr>
     <w:rPr>
-      <w:rFonts w:ascii="Palatino Linotype" w:cs="Palatino Linotype" w:eastAsia="Palatino Linotype" w:hAnsi="Palatino Linotype"/>
+      <w:rFonts w:ascii="TeX Gyre Pagella" w:cs="TeX Gyre Pagella" w:eastAsia="TeX Gyre Pagella" w:hAnsi="TeX Gyre Pagella"/>
       <w:color w:val="FFFFFF"/>
       <w:sz w:val="20"/>
     </w:rPr>
@@ -71395,7 +71395,7 @@
       <w:shd w:color="auto" w:fill="3C7D3A" w:val="clear"/>
     </w:pPr>
     <w:rPr>
-      <w:rFonts w:ascii="Palatino Linotype" w:cs="Palatino Linotype" w:eastAsia="Palatino Linotype" w:hAnsi="Palatino Linotype"/>
+      <w:rFonts w:ascii="TeX Gyre Pagella" w:cs="TeX Gyre Pagella" w:eastAsia="TeX Gyre Pagella" w:hAnsi="TeX Gyre Pagella"/>
       <w:color w:val="FFFFFF"/>
       <w:sz w:val="20"/>
     </w:rPr>
@@ -71410,7 +71410,7 @@
       <w:shd w:color="auto" w:fill="1F5F99" w:val="clear"/>
     </w:pPr>
     <w:rPr>
-      <w:rFonts w:ascii="Palatino Linotype" w:cs="Palatino Linotype" w:eastAsia="Palatino Linotype" w:hAnsi="Palatino Linotype"/>
+      <w:rFonts w:ascii="TeX Gyre Pagella" w:cs="TeX Gyre Pagella" w:eastAsia="TeX Gyre Pagella" w:hAnsi="TeX Gyre Pagella"/>
       <w:color w:val="FFFFFF"/>
       <w:sz w:val="20"/>
     </w:rPr>
@@ -71425,7 +71425,7 @@
       <w:shd w:color="auto" w:fill="B22222" w:val="clear"/>
     </w:pPr>
     <w:rPr>
-      <w:rFonts w:ascii="Palatino Linotype" w:cs="Palatino Linotype" w:eastAsia="Palatino Linotype" w:hAnsi="Palatino Linotype"/>
+      <w:rFonts w:ascii="TeX Gyre Pagella" w:cs="TeX Gyre Pagella" w:eastAsia="TeX Gyre Pagella" w:hAnsi="TeX Gyre Pagella"/>
       <w:color w:val="FFFFFF"/>
       <w:sz w:val="20"/>
     </w:rPr>
@@ -71440,7 +71440,7 @@
       <w:shd w:color="auto" w:fill="B8860B" w:val="clear"/>
     </w:pPr>
     <w:rPr>
-      <w:rFonts w:ascii="Palatino Linotype" w:cs="Palatino Linotype" w:eastAsia="Palatino Linotype" w:hAnsi="Palatino Linotype"/>
+      <w:rFonts w:ascii="TeX Gyre Pagella" w:cs="TeX Gyre Pagella" w:eastAsia="TeX Gyre Pagella" w:hAnsi="TeX Gyre Pagella"/>
       <w:color w:val="FFFFFF"/>
       <w:sz w:val="20"/>
     </w:rPr>
@@ -71455,7 +71455,7 @@
       <w:shd w:color="auto" w:fill="E07B28" w:val="clear"/>
     </w:pPr>
     <w:rPr>
-      <w:rFonts w:ascii="Palatino Linotype" w:cs="Palatino Linotype" w:eastAsia="Palatino Linotype" w:hAnsi="Palatino Linotype"/>
+      <w:rFonts w:ascii="TeX Gyre Pagella" w:cs="TeX Gyre Pagella" w:eastAsia="TeX Gyre Pagella" w:hAnsi="TeX Gyre Pagella"/>
       <w:color w:val="FFFFFF"/>
       <w:sz w:val="20"/>
     </w:rPr>
@@ -71470,7 +71470,7 @@
       <w:shd w:color="auto" w:fill="767171" w:val="clear"/>
     </w:pPr>
     <w:rPr>
-      <w:rFonts w:ascii="Palatino Linotype" w:cs="Palatino Linotype" w:eastAsia="Palatino Linotype" w:hAnsi="Palatino Linotype"/>
+      <w:rFonts w:ascii="TeX Gyre Pagella" w:cs="TeX Gyre Pagella" w:eastAsia="TeX Gyre Pagella" w:hAnsi="TeX Gyre Pagella"/>
       <w:color w:val="FFFFFF"/>
       <w:sz w:val="20"/>
     </w:rPr>

</xml_diff>

<commit_message>
Fichas del 3.A.14, el 3.A.15, el 3.A.18 y el 3.A.19; enumeraciones en viñetas en todos los temas; cambios de Víctor
- 3.A.14: nota con el gráfico de la sostenibilidad del cártel en las
  estrategias condicionadas.
- 3.A.15: gráficos 1-5 pegados a su párrafo.
- 3.A.18: Bertrand diferenciado con el enfoque de direcciones en nota
  (p1 = p2 = c + t) y gráfico hotelling-reaccion en II.3.2 b).
- 3.A.19: tabla 6 con enteros (p = 13 - Q, c = 1) y gráfico del reparto
  (Nash, núcleo y Shapley) en III.2.
- Las enumeraciones en línea de los 13 temas pasan a viñetas con su
  introducción (regla nueva de CRITERIOS).
- Fichas de repaso nuevas (4 páginas) y reconstrucción de todos los temas.

Co-Authored-By: Claude Opus 5.5 <noreply@anthropic.com>
Claude-Session: https://claude.ai/code/session_01PWJgAjs4PN1Rvp3aLA4tqT
</commit_message>
<xml_diff>
--- a/oposicion/temario/tercer-ejercicio/3A10.docx
+++ b/oposicion/temario/tercer-ejercicio/3A10.docx
@@ -37,7 +37,7 @@
         <w:pStyle w:val="Paginasdeltema"/>
       </w:pPr>
       <w:r>
-        <w:t xml:space="preserve">Tema: 38 págs. · Anexos: 11 · Bibliografía: 6 (PDF)</w:t>
+        <w:t xml:space="preserve">Tema: 40 págs. · Anexos: 11 · Bibliografía: 6 (PDF)</w:t>
       </w:r>
     </w:p>
     <w:bookmarkStart w:id="30" w:name="introducci__n"/>
@@ -315,6 +315,7 @@
     </w:p>
     <w:p>
       <w:pPr>
+        <w:keepNext/>
         <w:numPr>
           <w:ilvl w:val="1"/>
           <w:numId w:val="1004"/>
@@ -328,7 +329,18 @@
         <w:t xml:space="preserve">Teórica</w:t>
       </w:r>
       <w:r>
-        <w:t xml:space="preserve">: la utilidad esperada es el lenguaje de toda la economía con riesgo: los seguros y la información asimétrica</w:t>
+        <w:t xml:space="preserve">: la utilidad esperada es el lenguaje de toda la economía con riesgo:</w:t>
+      </w:r>
+    </w:p>
+    <w:p>
+      <w:pPr>
+        <w:numPr>
+          <w:ilvl w:val="2"/>
+          <w:numId w:val="1005"/>
+        </w:numPr>
+      </w:pPr>
+      <w:r>
+        <w:t xml:space="preserve">los seguros y la información asimétrica</w:t>
       </w:r>
       <w:r>
         <w:t xml:space="preserve"> </w:t>
@@ -342,7 +354,18 @@
         </w:r>
       </w:hyperlink>
       <w:r>
-        <w:t xml:space="preserve">, los pagos esperados de la teoría de juegos y las subastas</w:t>
+        <w:t xml:space="preserve">;</w:t>
+      </w:r>
+    </w:p>
+    <w:p>
+      <w:pPr>
+        <w:numPr>
+          <w:ilvl w:val="2"/>
+          <w:numId w:val="1005"/>
+        </w:numPr>
+      </w:pPr>
+      <w:r>
+        <w:t xml:space="preserve">los pagos esperados de la teoría de juegos y las subastas</w:t>
       </w:r>
       <w:r>
         <w:t xml:space="preserve"> </w:t>
@@ -356,7 +379,18 @@
         </w:r>
       </w:hyperlink>
       <w:r>
-        <w:t xml:space="preserve">, el equilibrio general con mercados contingentes</w:t>
+        <w:t xml:space="preserve">;</w:t>
+      </w:r>
+    </w:p>
+    <w:p>
+      <w:pPr>
+        <w:numPr>
+          <w:ilvl w:val="2"/>
+          <w:numId w:val="1005"/>
+        </w:numPr>
+      </w:pPr>
+      <w:r>
+        <w:t xml:space="preserve">el equilibrio general con mercados contingentes</w:t>
       </w:r>
       <w:r>
         <w:t xml:space="preserve"> </w:t>
@@ -370,7 +404,18 @@
         </w:r>
       </w:hyperlink>
       <w:r>
-        <w:t xml:space="preserve">, el consumo y el ahorro con incertidumbre</w:t>
+        <w:t xml:space="preserve">;</w:t>
+      </w:r>
+    </w:p>
+    <w:p>
+      <w:pPr>
+        <w:numPr>
+          <w:ilvl w:val="2"/>
+          <w:numId w:val="1005"/>
+        </w:numPr>
+      </w:pPr>
+      <w:r>
+        <w:t xml:space="preserve">el consumo y el ahorro con incertidumbre</w:t>
       </w:r>
       <w:r>
         <w:t xml:space="preserve"> </w:t>
@@ -384,7 +429,18 @@
         </w:r>
       </w:hyperlink>
       <w:r>
-        <w:t xml:space="preserve">, la demanda de dinero como activo</w:t>
+        <w:t xml:space="preserve">;</w:t>
+      </w:r>
+    </w:p>
+    <w:p>
+      <w:pPr>
+        <w:numPr>
+          <w:ilvl w:val="2"/>
+          <w:numId w:val="1005"/>
+        </w:numPr>
+      </w:pPr>
+      <w:r>
+        <w:t xml:space="preserve">la demanda de dinero como activo</w:t>
       </w:r>
       <w:r>
         <w:t xml:space="preserve"> </w:t>
@@ -398,8 +454,16 @@
         </w:r>
       </w:hyperlink>
       <w:r>
-        <w:t xml:space="preserve"> </w:t>
-      </w:r>
+        <w:t xml:space="preserve">;</w:t>
+      </w:r>
+    </w:p>
+    <w:p>
+      <w:pPr>
+        <w:numPr>
+          <w:ilvl w:val="2"/>
+          <w:numId w:val="1005"/>
+        </w:numPr>
+      </w:pPr>
       <w:r>
         <w:t xml:space="preserve">y la teoría de carteras</w:t>
       </w:r>
@@ -475,7 +539,7 @@
       <w:pPr>
         <w:numPr>
           <w:ilvl w:val="1"/>
-          <w:numId w:val="1005"/>
+          <w:numId w:val="1006"/>
         </w:numPr>
       </w:pPr>
       <w:r>
@@ -542,7 +606,7 @@
       <w:pPr>
         <w:numPr>
           <w:ilvl w:val="1"/>
-          <w:numId w:val="1005"/>
+          <w:numId w:val="1006"/>
         </w:numPr>
       </w:pPr>
       <w:r>
@@ -618,7 +682,7 @@
       <w:pPr>
         <w:numPr>
           <w:ilvl w:val="1"/>
-          <w:numId w:val="1005"/>
+          <w:numId w:val="1006"/>
         </w:numPr>
       </w:pPr>
       <w:r>
@@ -713,7 +777,7 @@
       <w:pPr>
         <w:numPr>
           <w:ilvl w:val="1"/>
-          <w:numId w:val="1005"/>
+          <w:numId w:val="1006"/>
         </w:numPr>
       </w:pPr>
       <w:r>
@@ -917,7 +981,7 @@
       <w:pPr>
         <w:numPr>
           <w:ilvl w:val="1"/>
-          <w:numId w:val="1005"/>
+          <w:numId w:val="1006"/>
         </w:numPr>
       </w:pPr>
       <w:r>
@@ -1230,7 +1294,7 @@
       <w:pPr>
         <w:numPr>
           <w:ilvl w:val="1"/>
-          <w:numId w:val="1006"/>
+          <w:numId w:val="1007"/>
         </w:numPr>
       </w:pPr>
       <w:r>
@@ -1254,7 +1318,7 @@
       <w:pPr>
         <w:numPr>
           <w:ilvl w:val="1"/>
-          <w:numId w:val="1006"/>
+          <w:numId w:val="1007"/>
         </w:numPr>
       </w:pPr>
       <w:r>
@@ -1265,7 +1329,7 @@
       <w:pPr>
         <w:numPr>
           <w:ilvl w:val="1"/>
-          <w:numId w:val="1006"/>
+          <w:numId w:val="1007"/>
         </w:numPr>
       </w:pPr>
       <w:r>
@@ -1276,7 +1340,7 @@
       <w:pPr>
         <w:numPr>
           <w:ilvl w:val="1"/>
-          <w:numId w:val="1006"/>
+          <w:numId w:val="1007"/>
         </w:numPr>
       </w:pPr>
       <w:r>
@@ -1306,9 +1370,10 @@
     </w:p>
     <w:p>
       <w:pPr>
+        <w:keepNext/>
         <w:numPr>
           <w:ilvl w:val="1"/>
-          <w:numId w:val="1007"/>
+          <w:numId w:val="1008"/>
         </w:numPr>
       </w:pPr>
       <w:r>
@@ -1333,7 +1398,18 @@
         </w:r>
       </w:hyperlink>
       <w:r>
-        <w:t xml:space="preserve">). Construiremos la función de utilidad esperada a partir de axiomas sobre las preferencias y estudiaremos sus 2 componentes, la utilidad de</w:t>
+        <w:t xml:space="preserve">):</w:t>
+      </w:r>
+    </w:p>
+    <w:p>
+      <w:pPr>
+        <w:numPr>
+          <w:ilvl w:val="2"/>
+          <w:numId w:val="1009"/>
+        </w:numPr>
+      </w:pPr>
+      <w:r>
+        <w:t xml:space="preserve">construiremos la función de utilidad esperada a partir de axiomas sobre las preferencias y estudiaremos sus 2 componentes, la utilidad de</w:t>
       </w:r>
       <w:r>
         <w:t xml:space="preserve"> </w:t>
@@ -1356,7 +1432,18 @@
         </w:r>
       </w:hyperlink>
       <w:r>
-        <w:t xml:space="preserve">); derivaremos con ella la demanda de seguros y, como profundización, la decisión de la empresa aversa al riesgo (</w:t>
+        <w:t xml:space="preserve">);</w:t>
+      </w:r>
+    </w:p>
+    <w:p>
+      <w:pPr>
+        <w:numPr>
+          <w:ilvl w:val="2"/>
+          <w:numId w:val="1009"/>
+        </w:numPr>
+      </w:pPr>
+      <w:r>
+        <w:t xml:space="preserve">derivaremos con ella la demanda de seguros y, como profundización, la decisión de la empresa aversa al riesgo (</w:t>
       </w:r>
       <w:hyperlink w:anchor="sec_aplicaciones">
         <w:r>
@@ -1378,7 +1465,18 @@
         </w:r>
       </w:hyperlink>
       <w:r>
-        <w:t xml:space="preserve">, y la extenderemos a la utilidad que depende del estado y a los bienes contingentes (</w:t>
+        <w:t xml:space="preserve">;</w:t>
+      </w:r>
+    </w:p>
+    <w:p>
+      <w:pPr>
+        <w:numPr>
+          <w:ilvl w:val="2"/>
+          <w:numId w:val="1009"/>
+        </w:numPr>
+      </w:pPr>
+      <w:r>
+        <w:t xml:space="preserve">y la extenderemos a la utilidad que depende del estado y a los bienes contingentes (</w:t>
       </w:r>
       <w:hyperlink w:anchor="sec_extensiones">
         <w:r>
@@ -1396,7 +1494,7 @@
       <w:pPr>
         <w:numPr>
           <w:ilvl w:val="1"/>
-          <w:numId w:val="1007"/>
+          <w:numId w:val="1008"/>
         </w:numPr>
       </w:pPr>
       <w:r>
@@ -1450,7 +1548,7 @@
       <w:pPr>
         <w:numPr>
           <w:ilvl w:val="1"/>
-          <w:numId w:val="1007"/>
+          <w:numId w:val="1008"/>
         </w:numPr>
       </w:pPr>
       <w:r>
@@ -2270,7 +2368,7 @@
       <w:pPr>
         <w:numPr>
           <w:ilvl w:val="0"/>
-          <w:numId w:val="1008"/>
+          <w:numId w:val="1010"/>
         </w:numPr>
       </w:pPr>
       <w:r>
@@ -2313,7 +2411,7 @@
         <w:keepNext/>
         <w:numPr>
           <w:ilvl w:val="0"/>
-          <w:numId w:val="1009"/>
+          <w:numId w:val="1011"/>
         </w:numPr>
       </w:pPr>
       <w:r>
@@ -2382,7 +2480,7 @@
       <w:pPr>
         <w:numPr>
           <w:ilvl w:val="1"/>
-          <w:numId w:val="1010"/>
+          <w:numId w:val="1012"/>
         </w:numPr>
       </w:pPr>
       <w:r>
@@ -2391,9 +2489,10 @@
     </w:p>
     <w:p>
       <w:pPr>
+        <w:keepNext/>
         <w:numPr>
           <w:ilvl w:val="0"/>
-          <w:numId w:val="1009"/>
+          <w:numId w:val="1011"/>
         </w:numPr>
       </w:pPr>
       <w:r>
@@ -2427,84 +2526,10 @@
         </w:r>
       </w:hyperlink>
       <w:r>
-        <w:t xml:space="preserve">: un</w:t>
-      </w:r>
-      <w:r>
-        <w:t xml:space="preserve"> </w:t>
-      </w:r>
-      <w:r>
-        <w:rPr>
-          <w:i/>
-          <w:iCs/>
-        </w:rPr>
-        <w:t xml:space="preserve">conjunto de elección</w:t>
-      </w:r>
-      <w:r>
-        <w:t xml:space="preserve">, una</w:t>
-      </w:r>
-      <w:r>
-        <w:t xml:space="preserve"> </w:t>
-      </w:r>
-      <w:r>
-        <w:rPr>
-          <w:i/>
-          <w:iCs/>
-        </w:rPr>
-        <w:t xml:space="preserve">relación de preferencia</w:t>
-      </w:r>
-      <w:r>
-        <w:t xml:space="preserve"> </w:t>
-      </w:r>
-      <w:r>
-        <w:t xml:space="preserve">sobre él, unos</w:t>
-      </w:r>
-      <w:r>
-        <w:t xml:space="preserve"> </w:t>
-      </w:r>
-      <w:r>
-        <w:rPr>
-          <w:i/>
-          <w:iCs/>
-        </w:rPr>
-        <w:t xml:space="preserve">axiomas</w:t>
-      </w:r>
-      <w:r>
-        <w:t xml:space="preserve"> </w:t>
-      </w:r>
-      <w:r>
-        <w:t xml:space="preserve">que permiten representarla con una</w:t>
-      </w:r>
-      <w:r>
-        <w:t xml:space="preserve"> </w:t>
-      </w:r>
-      <w:r>
-        <w:rPr>
-          <w:i/>
-          <w:iCs/>
-        </w:rPr>
-        <w:t xml:space="preserve">función de utilidad</w:t>
-      </w:r>
-      <w:r>
-        <w:t xml:space="preserve"> </w:t>
-      </w:r>
-      <w:r>
-        <w:t xml:space="preserve">y un</w:t>
-      </w:r>
-      <w:r>
-        <w:t xml:space="preserve"> </w:t>
-      </w:r>
-      <w:r>
-        <w:rPr>
-          <w:i/>
-          <w:iCs/>
-        </w:rPr>
-        <w:t xml:space="preserve">problema de maximización</w:t>
-      </w:r>
-      <w:r>
-        <w:t xml:space="preserve"> </w:t>
-      </w:r>
-      <w:r>
-        <w:t xml:space="preserve">del que sale la decisión óptima (gráfico </w:t>
+        <w:t xml:space="preserve"> </w:t>
+      </w:r>
+      <w:r>
+        <w:t xml:space="preserve">(gráfico </w:t>
       </w:r>
       <w:hyperlink w:anchor="fig_esquema_tue">
         <w:r>
@@ -2515,7 +2540,136 @@
         </w:r>
       </w:hyperlink>
       <w:r>
-        <w:t xml:space="preserve">). Sobre ella se construyen las finanzas modernas, el equilibrio general con incertidumbre de</w:t>
+        <w:t xml:space="preserve">):</w:t>
+      </w:r>
+    </w:p>
+    <w:p>
+      <w:pPr>
+        <w:numPr>
+          <w:ilvl w:val="1"/>
+          <w:numId w:val="1013"/>
+        </w:numPr>
+      </w:pPr>
+      <w:r>
+        <w:t xml:space="preserve">un</w:t>
+      </w:r>
+      <w:r>
+        <w:t xml:space="preserve"> </w:t>
+      </w:r>
+      <w:r>
+        <w:rPr>
+          <w:i/>
+          <w:iCs/>
+        </w:rPr>
+        <w:t xml:space="preserve">conjunto de elección</w:t>
+      </w:r>
+      <w:r>
+        <w:t xml:space="preserve">;</w:t>
+      </w:r>
+    </w:p>
+    <w:p>
+      <w:pPr>
+        <w:numPr>
+          <w:ilvl w:val="1"/>
+          <w:numId w:val="1013"/>
+        </w:numPr>
+      </w:pPr>
+      <w:r>
+        <w:t xml:space="preserve">una</w:t>
+      </w:r>
+      <w:r>
+        <w:t xml:space="preserve"> </w:t>
+      </w:r>
+      <w:r>
+        <w:rPr>
+          <w:i/>
+          <w:iCs/>
+        </w:rPr>
+        <w:t xml:space="preserve">relación de preferencia</w:t>
+      </w:r>
+      <w:r>
+        <w:t xml:space="preserve"> </w:t>
+      </w:r>
+      <w:r>
+        <w:t xml:space="preserve">sobre él;</w:t>
+      </w:r>
+    </w:p>
+    <w:p>
+      <w:pPr>
+        <w:numPr>
+          <w:ilvl w:val="1"/>
+          <w:numId w:val="1013"/>
+        </w:numPr>
+      </w:pPr>
+      <w:r>
+        <w:t xml:space="preserve">unos</w:t>
+      </w:r>
+      <w:r>
+        <w:t xml:space="preserve"> </w:t>
+      </w:r>
+      <w:r>
+        <w:rPr>
+          <w:i/>
+          <w:iCs/>
+        </w:rPr>
+        <w:t xml:space="preserve">axiomas</w:t>
+      </w:r>
+      <w:r>
+        <w:t xml:space="preserve"> </w:t>
+      </w:r>
+      <w:r>
+        <w:t xml:space="preserve">que permiten representarla con una</w:t>
+      </w:r>
+      <w:r>
+        <w:t xml:space="preserve"> </w:t>
+      </w:r>
+      <w:r>
+        <w:rPr>
+          <w:i/>
+          <w:iCs/>
+        </w:rPr>
+        <w:t xml:space="preserve">función de utilidad</w:t>
+      </w:r>
+      <w:r>
+        <w:t xml:space="preserve">;</w:t>
+      </w:r>
+    </w:p>
+    <w:p>
+      <w:pPr>
+        <w:numPr>
+          <w:ilvl w:val="1"/>
+          <w:numId w:val="1013"/>
+        </w:numPr>
+      </w:pPr>
+      <w:r>
+        <w:t xml:space="preserve">y un</w:t>
+      </w:r>
+      <w:r>
+        <w:t xml:space="preserve"> </w:t>
+      </w:r>
+      <w:r>
+        <w:rPr>
+          <w:i/>
+          <w:iCs/>
+        </w:rPr>
+        <w:t xml:space="preserve">problema de maximización</w:t>
+      </w:r>
+      <w:r>
+        <w:t xml:space="preserve"> </w:t>
+      </w:r>
+      <w:r>
+        <w:t xml:space="preserve">del que sale la decisión óptima.</w:t>
+      </w:r>
+    </w:p>
+    <w:p>
+      <w:pPr>
+        <w:numPr>
+          <w:ilvl w:val="0"/>
+          <w:numId w:val="1011"/>
+        </w:numPr>
+      </w:pPr>
+      <w:r>
+        <w:t xml:space="preserve">Sobre ella se construyen las finanzas modernas, el equilibrio general con incertidumbre de</w:t>
       </w:r>
       <w:r>
         <w:t xml:space="preserve"> </w:t>
@@ -2553,7 +2707,7 @@
         <w:keepNext/>
         <w:numPr>
           <w:ilvl w:val="0"/>
-          <w:numId w:val="1009"/>
+          <w:numId w:val="1011"/>
         </w:numPr>
       </w:pPr>
       <w:r>
@@ -2564,7 +2718,7 @@
       <w:pPr>
         <w:numPr>
           <w:ilvl w:val="1"/>
-          <w:numId w:val="1011"/>
+          <w:numId w:val="1014"/>
         </w:numPr>
       </w:pPr>
       <w:r>
@@ -2604,7 +2758,7 @@
       <w:pPr>
         <w:numPr>
           <w:ilvl w:val="1"/>
-          <w:numId w:val="1011"/>
+          <w:numId w:val="1014"/>
         </w:numPr>
       </w:pPr>
       <w:r>
@@ -2844,7 +2998,7 @@
       <w:pPr>
         <w:numPr>
           <w:ilvl w:val="0"/>
-          <w:numId w:val="1012"/>
+          <w:numId w:val="1015"/>
         </w:numPr>
       </w:pPr>
       <w:r>
@@ -2891,7 +3045,7 @@
         <w:keepNext/>
         <w:numPr>
           <w:ilvl w:val="0"/>
-          <w:numId w:val="1013"/>
+          <w:numId w:val="1016"/>
         </w:numPr>
       </w:pPr>
       <w:r>
@@ -2909,7 +3063,7 @@
       <w:pPr>
         <w:numPr>
           <w:ilvl w:val="1"/>
-          <w:numId w:val="1014"/>
+          <w:numId w:val="1017"/>
         </w:numPr>
       </w:pPr>
       <w:r>
@@ -3050,7 +3204,7 @@
       <w:pPr>
         <w:numPr>
           <w:ilvl w:val="1"/>
-          <w:numId w:val="1014"/>
+          <w:numId w:val="1017"/>
         </w:numPr>
       </w:pPr>
       <w:r>
@@ -3316,7 +3470,7 @@
       <w:pPr>
         <w:numPr>
           <w:ilvl w:val="2"/>
-          <w:numId w:val="1015"/>
+          <w:numId w:val="1018"/>
         </w:numPr>
       </w:pPr>
       <w:r>
@@ -3345,7 +3499,7 @@
       <w:pPr>
         <w:numPr>
           <w:ilvl w:val="2"/>
-          <w:numId w:val="1015"/>
+          <w:numId w:val="1018"/>
         </w:numPr>
       </w:pPr>
       <w:r>
@@ -3606,7 +3760,7 @@
       <w:pPr>
         <w:numPr>
           <w:ilvl w:val="2"/>
-          <w:numId w:val="1015"/>
+          <w:numId w:val="1018"/>
         </w:numPr>
       </w:pPr>
       <w:r>
@@ -3624,7 +3778,7 @@
       <w:pPr>
         <w:numPr>
           <w:ilvl w:val="1"/>
-          <w:numId w:val="1014"/>
+          <w:numId w:val="1017"/>
         </w:numPr>
       </w:pPr>
       <w:r>
@@ -3702,7 +3856,7 @@
       <w:pPr>
         <w:numPr>
           <w:ilvl w:val="1"/>
-          <w:numId w:val="1014"/>
+          <w:numId w:val="1017"/>
         </w:numPr>
       </w:pPr>
       <w:r>
@@ -4029,7 +4183,7 @@
         <w:keepNext/>
         <w:numPr>
           <w:ilvl w:val="0"/>
-          <w:numId w:val="1016"/>
+          <w:numId w:val="1019"/>
         </w:numPr>
       </w:pPr>
       <w:r>
@@ -4122,7 +4276,7 @@
         <w:keepNext/>
         <w:numPr>
           <w:ilvl w:val="1"/>
-          <w:numId w:val="1017"/>
+          <w:numId w:val="1020"/>
         </w:numPr>
       </w:pPr>
       <w:r>
@@ -4140,7 +4294,7 @@
       <w:pPr>
         <w:numPr>
           <w:ilvl w:val="2"/>
-          <w:numId w:val="1018"/>
+          <w:numId w:val="1021"/>
         </w:numPr>
       </w:pPr>
       <w:r>
@@ -4339,7 +4493,7 @@
       <w:pPr>
         <w:numPr>
           <w:ilvl w:val="2"/>
-          <w:numId w:val="1018"/>
+          <w:numId w:val="1021"/>
         </w:numPr>
       </w:pPr>
       <w:r>
@@ -4452,7 +4606,7 @@
       <w:pPr>
         <w:numPr>
           <w:ilvl w:val="2"/>
-          <w:numId w:val="1018"/>
+          <w:numId w:val="1021"/>
         </w:numPr>
       </w:pPr>
       <w:r>
@@ -4798,7 +4952,7 @@
         <w:keepNext/>
         <w:numPr>
           <w:ilvl w:val="1"/>
-          <w:numId w:val="1017"/>
+          <w:numId w:val="1020"/>
         </w:numPr>
       </w:pPr>
       <w:r>
@@ -4816,7 +4970,7 @@
       <w:pPr>
         <w:numPr>
           <w:ilvl w:val="2"/>
-          <w:numId w:val="1019"/>
+          <w:numId w:val="1022"/>
         </w:numPr>
       </w:pPr>
       <w:r>
@@ -5328,7 +5482,7 @@
       <w:pPr>
         <w:numPr>
           <w:ilvl w:val="2"/>
-          <w:numId w:val="1019"/>
+          <w:numId w:val="1022"/>
         </w:numPr>
       </w:pPr>
       <w:r>
@@ -5767,7 +5921,7 @@
       <w:pPr>
         <w:numPr>
           <w:ilvl w:val="0"/>
-          <w:numId w:val="1020"/>
+          <w:numId w:val="1023"/>
         </w:numPr>
       </w:pPr>
       <w:r>
@@ -6087,7 +6241,7 @@
       <w:pPr>
         <w:numPr>
           <w:ilvl w:val="0"/>
-          <w:numId w:val="1021"/>
+          <w:numId w:val="1024"/>
         </w:numPr>
       </w:pPr>
       <w:r>
@@ -6226,7 +6380,7 @@
       <w:pPr>
         <w:numPr>
           <w:ilvl w:val="0"/>
-          <w:numId w:val="1021"/>
+          <w:numId w:val="1024"/>
         </w:numPr>
       </w:pPr>
       <w:r>
@@ -6512,7 +6666,7 @@
         <w:keepNext/>
         <w:numPr>
           <w:ilvl w:val="0"/>
-          <w:numId w:val="1022"/>
+          <w:numId w:val="1025"/>
         </w:numPr>
       </w:pPr>
       <w:r>
@@ -6533,7 +6687,7 @@
       <w:pPr>
         <w:numPr>
           <w:ilvl w:val="1"/>
-          <w:numId w:val="1023"/>
+          <w:numId w:val="1026"/>
         </w:numPr>
       </w:pPr>
       <w:r>
@@ -6554,7 +6708,7 @@
       <w:pPr>
         <w:numPr>
           <w:ilvl w:val="1"/>
-          <w:numId w:val="1023"/>
+          <w:numId w:val="1026"/>
         </w:numPr>
       </w:pPr>
       <w:r>
@@ -6594,7 +6748,7 @@
       <w:pPr>
         <w:numPr>
           <w:ilvl w:val="1"/>
-          <w:numId w:val="1023"/>
+          <w:numId w:val="1026"/>
         </w:numPr>
       </w:pPr>
       <m:oMath>
@@ -6752,7 +6906,7 @@
       <w:pPr>
         <w:numPr>
           <w:ilvl w:val="1"/>
-          <w:numId w:val="1023"/>
+          <w:numId w:val="1026"/>
         </w:numPr>
       </w:pPr>
       <m:oMath>
@@ -6803,7 +6957,7 @@
       <w:pPr>
         <w:numPr>
           <w:ilvl w:val="0"/>
-          <w:numId w:val="1022"/>
+          <w:numId w:val="1025"/>
         </w:numPr>
       </w:pPr>
       <w:r>
@@ -7119,7 +7273,7 @@
       <w:pPr>
         <w:numPr>
           <w:ilvl w:val="0"/>
-          <w:numId w:val="1022"/>
+          <w:numId w:val="1025"/>
         </w:numPr>
       </w:pPr>
       <w:r>
@@ -7392,7 +7546,7 @@
       <w:pPr>
         <w:numPr>
           <w:ilvl w:val="0"/>
-          <w:numId w:val="1024"/>
+          <w:numId w:val="1027"/>
         </w:numPr>
       </w:pPr>
       <w:r>
@@ -7432,7 +7586,7 @@
         <w:keepNext/>
         <w:numPr>
           <w:ilvl w:val="0"/>
-          <w:numId w:val="1025"/>
+          <w:numId w:val="1028"/>
         </w:numPr>
       </w:pPr>
       <w:r>
@@ -7443,7 +7597,7 @@
       <w:pPr>
         <w:numPr>
           <w:ilvl w:val="1"/>
-          <w:numId w:val="1026"/>
+          <w:numId w:val="1029"/>
         </w:numPr>
       </w:pPr>
       <w:r>
@@ -7529,7 +7683,7 @@
       <w:pPr>
         <w:numPr>
           <w:ilvl w:val="1"/>
-          <w:numId w:val="1026"/>
+          <w:numId w:val="1029"/>
         </w:numPr>
       </w:pPr>
       <w:r>
@@ -7614,7 +7768,7 @@
       <w:pPr>
         <w:numPr>
           <w:ilvl w:val="0"/>
-          <w:numId w:val="1025"/>
+          <w:numId w:val="1028"/>
         </w:numPr>
       </w:pPr>
       <w:r>
@@ -7726,7 +7880,7 @@
         <w:keepNext/>
         <w:numPr>
           <w:ilvl w:val="0"/>
-          <w:numId w:val="1027"/>
+          <w:numId w:val="1030"/>
         </w:numPr>
       </w:pPr>
       <w:r>
@@ -7737,7 +7891,7 @@
       <w:pPr>
         <w:numPr>
           <w:ilvl w:val="1"/>
-          <w:numId w:val="1028"/>
+          <w:numId w:val="1031"/>
         </w:numPr>
       </w:pPr>
       <w:r>
@@ -7933,7 +8087,7 @@
       <w:pPr>
         <w:numPr>
           <w:ilvl w:val="1"/>
-          <w:numId w:val="1028"/>
+          <w:numId w:val="1031"/>
         </w:numPr>
       </w:pPr>
       <w:r>
@@ -8078,7 +8232,7 @@
       <w:pPr>
         <w:numPr>
           <w:ilvl w:val="1"/>
-          <w:numId w:val="1028"/>
+          <w:numId w:val="1031"/>
         </w:numPr>
       </w:pPr>
       <w:r>
@@ -8226,7 +8380,7 @@
       <w:pPr>
         <w:numPr>
           <w:ilvl w:val="0"/>
-          <w:numId w:val="1027"/>
+          <w:numId w:val="1030"/>
         </w:numPr>
       </w:pPr>
       <w:r>
@@ -8266,7 +8420,7 @@
       <w:pPr>
         <w:numPr>
           <w:ilvl w:val="0"/>
-          <w:numId w:val="1030"/>
+          <w:numId w:val="1033"/>
         </w:numPr>
       </w:pPr>
       <w:r>
@@ -8430,13 +8584,25 @@
     </w:p>
     <w:p>
       <w:pPr>
+        <w:keepNext/>
         <w:numPr>
           <w:ilvl w:val="0"/>
           <w:numId w:val="1000"/>
         </w:numPr>
       </w:pPr>
       <w:r>
-        <w:t xml:space="preserve">El consumidor es averso si y solo si</w:t>
+        <w:t xml:space="preserve">El consumidor es:</w:t>
+      </w:r>
+    </w:p>
+    <w:p>
+      <w:pPr>
+        <w:numPr>
+          <w:ilvl w:val="1"/>
+          <w:numId w:val="1034"/>
+        </w:numPr>
+      </w:pPr>
+      <w:r>
+        <w:t xml:space="preserve">averso si y solo si</w:t>
       </w:r>
       <w:r>
         <w:t xml:space="preserve"> </w:t>
@@ -8483,7 +8649,18 @@
         <w:t xml:space="preserve"> </w:t>
       </w:r>
       <w:r>
-        <w:t xml:space="preserve">para toda lotería no degenerada; neutral si</w:t>
+        <w:t xml:space="preserve">para toda lotería no degenerada;</w:t>
+      </w:r>
+    </w:p>
+    <w:p>
+      <w:pPr>
+        <w:numPr>
+          <w:ilvl w:val="1"/>
+          <w:numId w:val="1034"/>
+        </w:numPr>
+      </w:pPr>
+      <w:r>
+        <w:t xml:space="preserve">neutral si</w:t>
       </w:r>
       <w:r>
         <w:t xml:space="preserve"> </w:t>
@@ -8527,7 +8704,18 @@
         </m:d>
       </m:oMath>
       <w:r>
-        <w:t xml:space="preserve">, y amante si</w:t>
+        <w:t xml:space="preserve">;</w:t>
+      </w:r>
+    </w:p>
+    <w:p>
+      <w:pPr>
+        <w:numPr>
+          <w:ilvl w:val="1"/>
+          <w:numId w:val="1034"/>
+        </w:numPr>
+      </w:pPr>
+      <w:r>
+        <w:t xml:space="preserve">y amante si</w:t>
       </w:r>
       <w:r>
         <w:t xml:space="preserve"> </w:t>
@@ -8571,14 +8759,25 @@
         </m:d>
       </m:oMath>
       <w:r>
-        <w:t xml:space="preserve">. Es una forma equivalente de decir lo mismo que la concavidad.</w:t>
+        <w:t xml:space="preserve">.</w:t>
       </w:r>
     </w:p>
     <w:p>
       <w:pPr>
         <w:numPr>
           <w:ilvl w:val="0"/>
-          <w:numId w:val="1030"/>
+          <w:numId w:val="1033"/>
+        </w:numPr>
+      </w:pPr>
+      <w:r>
+        <w:t xml:space="preserve">Es una forma equivalente de decir lo mismo que la concavidad.</w:t>
+      </w:r>
+    </w:p>
+    <w:p>
+      <w:pPr>
+        <w:numPr>
+          <w:ilvl w:val="0"/>
+          <w:numId w:val="1033"/>
         </w:numPr>
       </w:pPr>
       <w:r>
@@ -8681,7 +8880,7 @@
         <w:keepNext/>
         <w:numPr>
           <w:ilvl w:val="0"/>
-          <w:numId w:val="1030"/>
+          <w:numId w:val="1033"/>
         </w:numPr>
       </w:pPr>
       <w:r>
@@ -8852,7 +9051,7 @@
       <w:pPr>
         <w:numPr>
           <w:ilvl w:val="1"/>
-          <w:numId w:val="1031"/>
+          <w:numId w:val="1035"/>
         </w:numPr>
       </w:pPr>
       <m:oMath>
@@ -9100,7 +9299,7 @@
       <w:pPr>
         <w:numPr>
           <w:ilvl w:val="1"/>
-          <w:numId w:val="1031"/>
+          <w:numId w:val="1035"/>
         </w:numPr>
       </w:pPr>
       <w:r>
@@ -9168,7 +9367,7 @@
       <w:pPr>
         <w:numPr>
           <w:ilvl w:val="1"/>
-          <w:numId w:val="1031"/>
+          <w:numId w:val="1035"/>
         </w:numPr>
       </w:pPr>
       <w:r>
@@ -9394,7 +9593,7 @@
         <w:keepNext/>
         <w:numPr>
           <w:ilvl w:val="0"/>
-          <w:numId w:val="1032"/>
+          <w:numId w:val="1036"/>
         </w:numPr>
       </w:pPr>
       <w:r>
@@ -9512,7 +9711,7 @@
       <w:pPr>
         <w:numPr>
           <w:ilvl w:val="1"/>
-          <w:numId w:val="1033"/>
+          <w:numId w:val="1037"/>
         </w:numPr>
       </w:pPr>
       <w:r>
@@ -9644,7 +9843,7 @@
       <w:pPr>
         <w:numPr>
           <w:ilvl w:val="1"/>
-          <w:numId w:val="1033"/>
+          <w:numId w:val="1037"/>
         </w:numPr>
       </w:pPr>
       <w:r>
@@ -9830,7 +10029,7 @@
       <w:pPr>
         <w:numPr>
           <w:ilvl w:val="0"/>
-          <w:numId w:val="1032"/>
+          <w:numId w:val="1036"/>
         </w:numPr>
       </w:pPr>
       <w:r>
@@ -9973,7 +10172,7 @@
       <w:pPr>
         <w:numPr>
           <w:ilvl w:val="0"/>
-          <w:numId w:val="1032"/>
+          <w:numId w:val="1036"/>
         </w:numPr>
       </w:pPr>
       <w:r>
@@ -10322,7 +10521,7 @@
         <w:keepNext/>
         <w:numPr>
           <w:ilvl w:val="0"/>
-          <w:numId w:val="1032"/>
+          <w:numId w:val="1036"/>
         </w:numPr>
       </w:pPr>
       <w:r>
@@ -10441,7 +10640,7 @@
       <w:pPr>
         <w:numPr>
           <w:ilvl w:val="1"/>
-          <w:numId w:val="1034"/>
+          <w:numId w:val="1038"/>
         </w:numPr>
       </w:pPr>
       <m:oMath>
@@ -10534,7 +10733,7 @@
       <w:pPr>
         <w:numPr>
           <w:ilvl w:val="1"/>
-          <w:numId w:val="1034"/>
+          <w:numId w:val="1038"/>
         </w:numPr>
       </w:pPr>
       <m:oMath>
@@ -10650,7 +10849,7 @@
       <w:pPr>
         <w:numPr>
           <w:ilvl w:val="1"/>
-          <w:numId w:val="1034"/>
+          <w:numId w:val="1038"/>
         </w:numPr>
       </w:pPr>
       <w:r>
@@ -10737,7 +10936,7 @@
       <w:pPr>
         <w:numPr>
           <w:ilvl w:val="1"/>
-          <w:numId w:val="1034"/>
+          <w:numId w:val="1038"/>
         </w:numPr>
       </w:pPr>
       <w:r>
@@ -10886,7 +11085,7 @@
         <w:keepNext/>
         <w:numPr>
           <w:ilvl w:val="0"/>
-          <w:numId w:val="1035"/>
+          <w:numId w:val="1039"/>
         </w:numPr>
       </w:pPr>
       <w:r>
@@ -10979,7 +11178,7 @@
       <w:pPr>
         <w:numPr>
           <w:ilvl w:val="1"/>
-          <w:numId w:val="1036"/>
+          <w:numId w:val="1040"/>
         </w:numPr>
       </w:pPr>
       <w:r>
@@ -11109,7 +11308,7 @@
       <w:pPr>
         <w:numPr>
           <w:ilvl w:val="1"/>
-          <w:numId w:val="1036"/>
+          <w:numId w:val="1040"/>
         </w:numPr>
       </w:pPr>
       <w:r>
@@ -11519,7 +11718,7 @@
       <w:pPr>
         <w:numPr>
           <w:ilvl w:val="1"/>
-          <w:numId w:val="1036"/>
+          <w:numId w:val="1040"/>
         </w:numPr>
       </w:pPr>
       <w:r>
@@ -11689,9 +11888,10 @@
     </w:p>
     <w:p>
       <w:pPr>
+        <w:keepNext/>
         <w:numPr>
           <w:ilvl w:val="0"/>
-          <w:numId w:val="1035"/>
+          <w:numId w:val="1039"/>
         </w:numPr>
       </w:pPr>
       <w:r>
@@ -11844,7 +12044,18 @@
         </m:r>
       </m:oMath>
       <w:r>
-        <w:t xml:space="preserve">. Es CARA si</w:t>
+        <w:t xml:space="preserve">. Según los parámetros, es:</w:t>
+      </w:r>
+    </w:p>
+    <w:p>
+      <w:pPr>
+        <w:numPr>
+          <w:ilvl w:val="1"/>
+          <w:numId w:val="1041"/>
+        </w:numPr>
+      </w:pPr>
+      <w:r>
+        <w:t xml:space="preserve">CARA si</w:t>
       </w:r>
       <w:r>
         <w:t xml:space="preserve"> </w:t>
@@ -11873,7 +12084,18 @@
         </m:r>
       </m:oMath>
       <w:r>
-        <w:t xml:space="preserve">; CRRA si</w:t>
+        <w:t xml:space="preserve">;</w:t>
+      </w:r>
+    </w:p>
+    <w:p>
+      <w:pPr>
+        <w:numPr>
+          <w:ilvl w:val="1"/>
+          <w:numId w:val="1041"/>
+        </w:numPr>
+      </w:pPr>
+      <w:r>
+        <w:t xml:space="preserve">CRRA si</w:t>
       </w:r>
       <w:r>
         <w:t xml:space="preserve"> </w:t>
@@ -11943,7 +12165,18 @@
         </m:r>
       </m:oMath>
       <w:r>
-        <w:t xml:space="preserve">, y cuadrática si</w:t>
+        <w:t xml:space="preserve">;</w:t>
+      </w:r>
+    </w:p>
+    <w:p>
+      <w:pPr>
+        <w:numPr>
+          <w:ilvl w:val="1"/>
+          <w:numId w:val="1041"/>
+        </w:numPr>
+      </w:pPr>
+      <w:r>
+        <w:t xml:space="preserve">y cuadrática si</w:t>
       </w:r>
       <w:r>
         <w:t xml:space="preserve"> </w:t>
@@ -12846,7 +13079,7 @@
       <w:pPr>
         <w:numPr>
           <w:ilvl w:val="0"/>
-          <w:numId w:val="1037"/>
+          <w:numId w:val="1042"/>
         </w:numPr>
       </w:pPr>
       <w:r>
@@ -12900,7 +13133,7 @@
       <w:pPr>
         <w:numPr>
           <w:ilvl w:val="0"/>
-          <w:numId w:val="1037"/>
+          <w:numId w:val="1042"/>
         </w:numPr>
       </w:pPr>
       <w:r>
@@ -13559,7 +13792,7 @@
         <w:keepNext/>
         <w:numPr>
           <w:ilvl w:val="0"/>
-          <w:numId w:val="1037"/>
+          <w:numId w:val="1042"/>
         </w:numPr>
       </w:pPr>
       <w:r>
@@ -13742,7 +13975,7 @@
       <w:pPr>
         <w:numPr>
           <w:ilvl w:val="1"/>
-          <w:numId w:val="1038"/>
+          <w:numId w:val="1043"/>
         </w:numPr>
       </w:pPr>
       <w:r>
@@ -13879,7 +14112,7 @@
       <w:pPr>
         <w:numPr>
           <w:ilvl w:val="1"/>
-          <w:numId w:val="1038"/>
+          <w:numId w:val="1043"/>
         </w:numPr>
       </w:pPr>
       <w:r>
@@ -13956,7 +14189,7 @@
       <w:pPr>
         <w:numPr>
           <w:ilvl w:val="1"/>
-          <w:numId w:val="1038"/>
+          <w:numId w:val="1043"/>
         </w:numPr>
       </w:pPr>
       <w:r>
@@ -14007,7 +14240,7 @@
       <w:pPr>
         <w:numPr>
           <w:ilvl w:val="0"/>
-          <w:numId w:val="1037"/>
+          <w:numId w:val="1042"/>
         </w:numPr>
       </w:pPr>
       <w:r>
@@ -14833,7 +15066,7 @@
       <w:pPr>
         <w:numPr>
           <w:ilvl w:val="0"/>
-          <w:numId w:val="1039"/>
+          <w:numId w:val="1044"/>
         </w:numPr>
       </w:pPr>
       <w:r>
@@ -15023,7 +15256,7 @@
       <w:pPr>
         <w:numPr>
           <w:ilvl w:val="0"/>
-          <w:numId w:val="1039"/>
+          <w:numId w:val="1044"/>
         </w:numPr>
       </w:pPr>
       <w:r>
@@ -15446,7 +15679,7 @@
       <w:pPr>
         <w:numPr>
           <w:ilvl w:val="0"/>
-          <w:numId w:val="1039"/>
+          <w:numId w:val="1044"/>
         </w:numPr>
       </w:pPr>
       <w:r>
@@ -15957,7 +16190,7 @@
         <w:keepNext/>
         <w:numPr>
           <w:ilvl w:val="0"/>
-          <w:numId w:val="1039"/>
+          <w:numId w:val="1044"/>
         </w:numPr>
       </w:pPr>
       <w:r>
@@ -15991,7 +16224,7 @@
       <w:pPr>
         <w:numPr>
           <w:ilvl w:val="1"/>
-          <w:numId w:val="1040"/>
+          <w:numId w:val="1045"/>
         </w:numPr>
       </w:pPr>
       <w:r>
@@ -16140,7 +16373,7 @@
       <w:pPr>
         <w:numPr>
           <w:ilvl w:val="1"/>
-          <w:numId w:val="1040"/>
+          <w:numId w:val="1045"/>
         </w:numPr>
       </w:pPr>
       <w:r>
@@ -16386,7 +16619,7 @@
       <w:pPr>
         <w:numPr>
           <w:ilvl w:val="0"/>
-          <w:numId w:val="1041"/>
+          <w:numId w:val="1046"/>
         </w:numPr>
       </w:pPr>
       <w:r>
@@ -16423,7 +16656,7 @@
       <w:pPr>
         <w:numPr>
           <w:ilvl w:val="0"/>
-          <w:numId w:val="1041"/>
+          <w:numId w:val="1046"/>
         </w:numPr>
       </w:pPr>
       <w:r>
@@ -16580,7 +16813,7 @@
       <w:pPr>
         <w:numPr>
           <w:ilvl w:val="0"/>
-          <w:numId w:val="1042"/>
+          <w:numId w:val="1047"/>
         </w:numPr>
       </w:pPr>
       <w:r>
@@ -16674,7 +16907,7 @@
       <w:pPr>
         <w:numPr>
           <w:ilvl w:val="0"/>
-          <w:numId w:val="1043"/>
+          <w:numId w:val="1048"/>
         </w:numPr>
       </w:pPr>
       <w:r>
@@ -17020,7 +17253,7 @@
       <w:pPr>
         <w:numPr>
           <w:ilvl w:val="0"/>
-          <w:numId w:val="1043"/>
+          <w:numId w:val="1048"/>
         </w:numPr>
       </w:pPr>
       <w:r>
@@ -17207,7 +17440,7 @@
       <w:pPr>
         <w:numPr>
           <w:ilvl w:val="0"/>
-          <w:numId w:val="1043"/>
+          <w:numId w:val="1048"/>
         </w:numPr>
       </w:pPr>
       <w:r>
@@ -17292,7 +17525,7 @@
       <w:pPr>
         <w:numPr>
           <w:ilvl w:val="0"/>
-          <w:numId w:val="1043"/>
+          <w:numId w:val="1048"/>
         </w:numPr>
       </w:pPr>
       <w:r>
@@ -17476,7 +17709,7 @@
       <w:pPr>
         <w:numPr>
           <w:ilvl w:val="0"/>
-          <w:numId w:val="1044"/>
+          <w:numId w:val="1049"/>
         </w:numPr>
       </w:pPr>
       <w:r>
@@ -18199,7 +18432,7 @@
       <w:pPr>
         <w:numPr>
           <w:ilvl w:val="0"/>
-          <w:numId w:val="1045"/>
+          <w:numId w:val="1050"/>
         </w:numPr>
       </w:pPr>
       <w:r>
@@ -18435,7 +18668,7 @@
       <w:pPr>
         <w:numPr>
           <w:ilvl w:val="0"/>
-          <w:numId w:val="1046"/>
+          <w:numId w:val="1051"/>
         </w:numPr>
       </w:pPr>
       <w:r>
@@ -18821,7 +19054,7 @@
       <w:pPr>
         <w:numPr>
           <w:ilvl w:val="0"/>
-          <w:numId w:val="1047"/>
+          <w:numId w:val="1052"/>
         </w:numPr>
       </w:pPr>
       <w:r>
@@ -18991,7 +19224,7 @@
       <w:pPr>
         <w:numPr>
           <w:ilvl w:val="0"/>
-          <w:numId w:val="1047"/>
+          <w:numId w:val="1052"/>
         </w:numPr>
       </w:pPr>
       <w:r>
@@ -19407,7 +19640,7 @@
       <w:pPr>
         <w:numPr>
           <w:ilvl w:val="0"/>
-          <w:numId w:val="1048"/>
+          <w:numId w:val="1053"/>
         </w:numPr>
       </w:pPr>
       <w:r>
@@ -19950,7 +20183,7 @@
       <w:pPr>
         <w:numPr>
           <w:ilvl w:val="0"/>
-          <w:numId w:val="1049"/>
+          <w:numId w:val="1054"/>
         </w:numPr>
       </w:pPr>
       <w:r>
@@ -20020,7 +20253,7 @@
         <w:keepNext/>
         <w:numPr>
           <w:ilvl w:val="0"/>
-          <w:numId w:val="1050"/>
+          <w:numId w:val="1055"/>
         </w:numPr>
       </w:pPr>
       <w:r>
@@ -20108,7 +20341,7 @@
       <w:pPr>
         <w:numPr>
           <w:ilvl w:val="1"/>
-          <w:numId w:val="1051"/>
+          <w:numId w:val="1056"/>
         </w:numPr>
       </w:pPr>
       <w:r>
@@ -20210,7 +20443,7 @@
       <w:pPr>
         <w:numPr>
           <w:ilvl w:val="1"/>
-          <w:numId w:val="1051"/>
+          <w:numId w:val="1056"/>
         </w:numPr>
       </w:pPr>
       <w:r>
@@ -20248,7 +20481,7 @@
       <w:pPr>
         <w:numPr>
           <w:ilvl w:val="1"/>
-          <w:numId w:val="1051"/>
+          <w:numId w:val="1056"/>
         </w:numPr>
       </w:pPr>
       <w:r>
@@ -20302,7 +20535,7 @@
       <w:pPr>
         <w:numPr>
           <w:ilvl w:val="0"/>
-          <w:numId w:val="1052"/>
+          <w:numId w:val="1057"/>
         </w:numPr>
       </w:pPr>
       <w:r>
@@ -20374,7 +20607,7 @@
       <w:pPr>
         <w:numPr>
           <w:ilvl w:val="0"/>
-          <w:numId w:val="1053"/>
+          <w:numId w:val="1058"/>
         </w:numPr>
       </w:pPr>
       <w:r>
@@ -20391,7 +20624,7 @@
       <w:pPr>
         <w:numPr>
           <w:ilvl w:val="0"/>
-          <w:numId w:val="1053"/>
+          <w:numId w:val="1058"/>
         </w:numPr>
       </w:pPr>
       <w:r>
@@ -20526,7 +20759,7 @@
       <w:pPr>
         <w:numPr>
           <w:ilvl w:val="0"/>
-          <w:numId w:val="1053"/>
+          <w:numId w:val="1058"/>
         </w:numPr>
       </w:pPr>
       <w:r>
@@ -22278,7 +22511,7 @@
       <w:pPr>
         <w:numPr>
           <w:ilvl w:val="0"/>
-          <w:numId w:val="1054"/>
+          <w:numId w:val="1059"/>
         </w:numPr>
       </w:pPr>
       <w:r>
@@ -22368,7 +22601,7 @@
       <w:pPr>
         <w:numPr>
           <w:ilvl w:val="0"/>
-          <w:numId w:val="1055"/>
+          <w:numId w:val="1060"/>
         </w:numPr>
       </w:pPr>
       <w:r>
@@ -22400,7 +22633,7 @@
       <w:pPr>
         <w:numPr>
           <w:ilvl w:val="0"/>
-          <w:numId w:val="1055"/>
+          <w:numId w:val="1060"/>
         </w:numPr>
       </w:pPr>
       <w:r>
@@ -22516,7 +22749,7 @@
       <w:pPr>
         <w:numPr>
           <w:ilvl w:val="0"/>
-          <w:numId w:val="1055"/>
+          <w:numId w:val="1060"/>
         </w:numPr>
       </w:pPr>
       <w:r>
@@ -22551,7 +22784,7 @@
       <w:pPr>
         <w:numPr>
           <w:ilvl w:val="0"/>
-          <w:numId w:val="1056"/>
+          <w:numId w:val="1061"/>
         </w:numPr>
       </w:pPr>
       <w:r>
@@ -22981,7 +23214,7 @@
       <w:pPr>
         <w:numPr>
           <w:ilvl w:val="0"/>
-          <w:numId w:val="1056"/>
+          <w:numId w:val="1061"/>
         </w:numPr>
       </w:pPr>
       <w:r>
@@ -23505,7 +23738,7 @@
       <w:pPr>
         <w:numPr>
           <w:ilvl w:val="0"/>
-          <w:numId w:val="1057"/>
+          <w:numId w:val="1062"/>
         </w:numPr>
       </w:pPr>
       <w:r>
@@ -23557,7 +23790,7 @@
       <w:pPr>
         <w:numPr>
           <w:ilvl w:val="0"/>
-          <w:numId w:val="1058"/>
+          <w:numId w:val="1063"/>
         </w:numPr>
       </w:pPr>
       <w:r>
@@ -23586,7 +23819,7 @@
       <w:pPr>
         <w:numPr>
           <w:ilvl w:val="0"/>
-          <w:numId w:val="1059"/>
+          <w:numId w:val="1064"/>
         </w:numPr>
       </w:pPr>
       <w:r>
@@ -23639,7 +23872,7 @@
       <w:pPr>
         <w:numPr>
           <w:ilvl w:val="0"/>
-          <w:numId w:val="1060"/>
+          <w:numId w:val="1065"/>
         </w:numPr>
       </w:pPr>
       <w:r>
@@ -23825,7 +24058,7 @@
       <w:pPr>
         <w:numPr>
           <w:ilvl w:val="0"/>
-          <w:numId w:val="1060"/>
+          <w:numId w:val="1065"/>
         </w:numPr>
       </w:pPr>
       <w:r>
@@ -24150,7 +24383,7 @@
       <w:pPr>
         <w:numPr>
           <w:ilvl w:val="0"/>
-          <w:numId w:val="1061"/>
+          <w:numId w:val="1066"/>
         </w:numPr>
       </w:pPr>
       <w:r>
@@ -24330,7 +24563,7 @@
       <w:pPr>
         <w:numPr>
           <w:ilvl w:val="0"/>
-          <w:numId w:val="1061"/>
+          <w:numId w:val="1066"/>
         </w:numPr>
       </w:pPr>
       <w:r>
@@ -24788,7 +25021,7 @@
       <w:pPr>
         <w:numPr>
           <w:ilvl w:val="0"/>
-          <w:numId w:val="1061"/>
+          <w:numId w:val="1066"/>
         </w:numPr>
       </w:pPr>
       <w:r>
@@ -24875,7 +25108,7 @@
       <w:pPr>
         <w:numPr>
           <w:ilvl w:val="0"/>
-          <w:numId w:val="1062"/>
+          <w:numId w:val="1067"/>
         </w:numPr>
       </w:pPr>
       <w:r>
@@ -24932,7 +25165,7 @@
       <w:pPr>
         <w:numPr>
           <w:ilvl w:val="0"/>
-          <w:numId w:val="1063"/>
+          <w:numId w:val="1068"/>
         </w:numPr>
       </w:pPr>
       <w:r>
@@ -25119,7 +25352,7 @@
       <w:pPr>
         <w:numPr>
           <w:ilvl w:val="0"/>
-          <w:numId w:val="1064"/>
+          <w:numId w:val="1069"/>
         </w:numPr>
       </w:pPr>
       <w:r>
@@ -25184,7 +25417,7 @@
         <w:keepNext/>
         <w:numPr>
           <w:ilvl w:val="0"/>
-          <w:numId w:val="1065"/>
+          <w:numId w:val="1070"/>
         </w:numPr>
       </w:pPr>
       <w:r>
@@ -25236,7 +25469,7 @@
       <w:pPr>
         <w:numPr>
           <w:ilvl w:val="1"/>
-          <w:numId w:val="1066"/>
+          <w:numId w:val="1071"/>
         </w:numPr>
       </w:pPr>
       <w:r>
@@ -25280,7 +25513,7 @@
       <w:pPr>
         <w:numPr>
           <w:ilvl w:val="1"/>
-          <w:numId w:val="1066"/>
+          <w:numId w:val="1071"/>
         </w:numPr>
       </w:pPr>
       <w:r>
@@ -25292,7 +25525,7 @@
         <w:keepNext/>
         <w:numPr>
           <w:ilvl w:val="0"/>
-          <w:numId w:val="1065"/>
+          <w:numId w:val="1070"/>
         </w:numPr>
       </w:pPr>
       <w:r>
@@ -25382,7 +25615,7 @@
       <w:pPr>
         <w:numPr>
           <w:ilvl w:val="1"/>
-          <w:numId w:val="1067"/>
+          <w:numId w:val="1072"/>
         </w:numPr>
       </w:pPr>
       <w:r>
@@ -25409,7 +25642,7 @@
       <w:pPr>
         <w:numPr>
           <w:ilvl w:val="1"/>
-          <w:numId w:val="1067"/>
+          <w:numId w:val="1072"/>
         </w:numPr>
       </w:pPr>
       <w:r>
@@ -25603,7 +25836,7 @@
       <w:pPr>
         <w:numPr>
           <w:ilvl w:val="0"/>
-          <w:numId w:val="1068"/>
+          <w:numId w:val="1073"/>
         </w:numPr>
       </w:pPr>
       <w:r>
@@ -25731,7 +25964,7 @@
         <w:keepNext/>
         <w:numPr>
           <w:ilvl w:val="0"/>
-          <w:numId w:val="1068"/>
+          <w:numId w:val="1073"/>
         </w:numPr>
       </w:pPr>
       <w:r>
@@ -25753,7 +25986,7 @@
       <w:pPr>
         <w:numPr>
           <w:ilvl w:val="1"/>
-          <w:numId w:val="1069"/>
+          <w:numId w:val="1074"/>
         </w:numPr>
       </w:pPr>
       <w:r>
@@ -25882,7 +26115,7 @@
       <w:pPr>
         <w:numPr>
           <w:ilvl w:val="1"/>
-          <w:numId w:val="1069"/>
+          <w:numId w:val="1074"/>
         </w:numPr>
       </w:pPr>
       <w:r>
@@ -26438,7 +26671,7 @@
       <w:pPr>
         <w:numPr>
           <w:ilvl w:val="0"/>
-          <w:numId w:val="1070"/>
+          <w:numId w:val="1075"/>
         </w:numPr>
       </w:pPr>
       <w:r>
@@ -26961,7 +27194,7 @@
         <w:keepNext/>
         <w:numPr>
           <w:ilvl w:val="0"/>
-          <w:numId w:val="1070"/>
+          <w:numId w:val="1075"/>
         </w:numPr>
       </w:pPr>
       <w:r>
@@ -27171,7 +27404,7 @@
       <w:pPr>
         <w:numPr>
           <w:ilvl w:val="1"/>
-          <w:numId w:val="1071"/>
+          <w:numId w:val="1076"/>
         </w:numPr>
       </w:pPr>
       <w:r>
@@ -27248,7 +27481,7 @@
       <w:pPr>
         <w:numPr>
           <w:ilvl w:val="1"/>
-          <w:numId w:val="1071"/>
+          <w:numId w:val="1076"/>
         </w:numPr>
       </w:pPr>
       <w:r>
@@ -27357,7 +27590,7 @@
         <w:keepNext/>
         <w:numPr>
           <w:ilvl w:val="0"/>
-          <w:numId w:val="1072"/>
+          <w:numId w:val="1077"/>
         </w:numPr>
       </w:pPr>
       <w:r>
@@ -27406,7 +27639,7 @@
       <w:pPr>
         <w:numPr>
           <w:ilvl w:val="1"/>
-          <w:numId w:val="1073"/>
+          <w:numId w:val="1078"/>
         </w:numPr>
       </w:pPr>
       <w:r>
@@ -27501,7 +27734,7 @@
       <w:pPr>
         <w:numPr>
           <w:ilvl w:val="1"/>
-          <w:numId w:val="1073"/>
+          <w:numId w:val="1078"/>
         </w:numPr>
       </w:pPr>
       <w:r>
@@ -27681,7 +27914,7 @@
       <w:pPr>
         <w:numPr>
           <w:ilvl w:val="0"/>
-          <w:numId w:val="1074"/>
+          <w:numId w:val="1079"/>
         </w:numPr>
       </w:pPr>
       <w:r>
@@ -27724,7 +27957,7 @@
       <w:pPr>
         <w:numPr>
           <w:ilvl w:val="0"/>
-          <w:numId w:val="1074"/>
+          <w:numId w:val="1079"/>
         </w:numPr>
       </w:pPr>
       <w:r>
@@ -27797,7 +28030,7 @@
       <w:pPr>
         <w:numPr>
           <w:ilvl w:val="0"/>
-          <w:numId w:val="1074"/>
+          <w:numId w:val="1079"/>
         </w:numPr>
       </w:pPr>
       <w:r>
@@ -27960,7 +28193,7 @@
         <w:keepNext/>
         <w:numPr>
           <w:ilvl w:val="0"/>
-          <w:numId w:val="1075"/>
+          <w:numId w:val="1080"/>
         </w:numPr>
       </w:pPr>
       <w:r>
@@ -28050,7 +28283,7 @@
       <w:pPr>
         <w:numPr>
           <w:ilvl w:val="1"/>
-          <w:numId w:val="1076"/>
+          <w:numId w:val="1081"/>
         </w:numPr>
       </w:pPr>
       <w:r>
@@ -28142,7 +28375,7 @@
       <w:pPr>
         <w:numPr>
           <w:ilvl w:val="1"/>
-          <w:numId w:val="1076"/>
+          <w:numId w:val="1081"/>
         </w:numPr>
       </w:pPr>
       <w:r>
@@ -28293,104 +28526,138 @@
     </w:p>
     <w:p>
       <w:pPr>
-        <w:numPr>
-          <w:ilvl w:val="0"/>
-          <w:numId w:val="1075"/>
-        </w:numPr>
-      </w:pPr>
-      <w:r>
-        <w:t xml:space="preserve">Es una teoría</w:t>
-      </w:r>
-      <w:r>
-        <w:t xml:space="preserve"> </w:t>
-      </w:r>
-      <w:r>
-        <w:rPr>
-          <w:i/>
-          <w:iCs/>
-        </w:rPr>
-        <w:t xml:space="preserve">descriptiva</w:t>
-      </w:r>
-      <w:r>
-        <w:t xml:space="preserve"> </w:t>
-      </w:r>
-      <w:r>
-        <w:t xml:space="preserve">(positiva), con base empírica: no dice cómo debería elegirse, sino cómo se elige. Se diferencia de la utilidad esperada en 3 cuestiones: cómo se</w:t>
-      </w:r>
-      <w:r>
-        <w:t xml:space="preserve"> </w:t>
-      </w:r>
-      <w:r>
-        <w:rPr>
-          <w:i/>
-          <w:iCs/>
-        </w:rPr>
-        <w:t xml:space="preserve">definen</w:t>
-      </w:r>
-      <w:r>
-        <w:t xml:space="preserve"> </w:t>
-      </w:r>
-      <w:r>
-        <w:t xml:space="preserve">las alternativas (como ganancias o pérdidas respecto a un punto de referencia), cómo se</w:t>
-      </w:r>
-      <w:r>
-        <w:t xml:space="preserve"> </w:t>
-      </w:r>
-      <w:r>
-        <w:rPr>
-          <w:i/>
-          <w:iCs/>
-        </w:rPr>
-        <w:t xml:space="preserve">valoran</w:t>
-      </w:r>
-      <w:r>
-        <w:t xml:space="preserve"> </w:t>
-      </w:r>
-      <w:r>
-        <w:t xml:space="preserve">(con una función de valor en forma de S) y cómo se</w:t>
-      </w:r>
-      <w:r>
-        <w:t xml:space="preserve"> </w:t>
-      </w:r>
-      <w:r>
-        <w:rPr>
-          <w:i/>
-          <w:iCs/>
-        </w:rPr>
-        <w:t xml:space="preserve">ponderan</w:t>
-      </w:r>
-      <w:r>
-        <w:t xml:space="preserve"> </w:t>
-      </w:r>
-      <w:r>
-        <w:t xml:space="preserve">(con pesos de decisión, no con probabilidades).</w:t>
-      </w:r>
-    </w:p>
-    <w:bookmarkEnd w:id="193"/>
-    <w:bookmarkStart w:id="208" w:name="b_modelo_3"/>
-    <w:p>
-      <w:pPr>
-        <w:pStyle w:val="Heading4"/>
-      </w:pPr>
-      <w:r>
-        <w:t xml:space="preserve">b) Modelo</w:t>
-      </w:r>
-    </w:p>
-    <w:bookmarkStart w:id="194" w:name="i_supuestos_3"/>
-    <w:p>
-      <w:pPr>
-        <w:pStyle w:val="Heading5"/>
-      </w:pPr>
-      <w:r>
-        <w:t xml:space="preserve">i) Supuestos</w:t>
-      </w:r>
-    </w:p>
-    <w:p>
-      <w:pPr>
         <w:keepNext/>
         <w:numPr>
           <w:ilvl w:val="0"/>
-          <w:numId w:val="1077"/>
+          <w:numId w:val="1080"/>
+        </w:numPr>
+      </w:pPr>
+      <w:r>
+        <w:t xml:space="preserve">Es una teoría</w:t>
+      </w:r>
+      <w:r>
+        <w:t xml:space="preserve"> </w:t>
+      </w:r>
+      <w:r>
+        <w:rPr>
+          <w:i/>
+          <w:iCs/>
+        </w:rPr>
+        <w:t xml:space="preserve">descriptiva</w:t>
+      </w:r>
+      <w:r>
+        <w:t xml:space="preserve"> </w:t>
+      </w:r>
+      <w:r>
+        <w:t xml:space="preserve">(positiva), con base empírica: no dice cómo debería elegirse, sino cómo se elige. Se diferencia de la utilidad esperada en 3 cuestiones:</w:t>
+      </w:r>
+    </w:p>
+    <w:p>
+      <w:pPr>
+        <w:numPr>
+          <w:ilvl w:val="1"/>
+          <w:numId w:val="1082"/>
+        </w:numPr>
+      </w:pPr>
+      <w:r>
+        <w:t xml:space="preserve">cómo se</w:t>
+      </w:r>
+      <w:r>
+        <w:t xml:space="preserve"> </w:t>
+      </w:r>
+      <w:r>
+        <w:rPr>
+          <w:i/>
+          <w:iCs/>
+        </w:rPr>
+        <w:t xml:space="preserve">definen</w:t>
+      </w:r>
+      <w:r>
+        <w:t xml:space="preserve"> </w:t>
+      </w:r>
+      <w:r>
+        <w:t xml:space="preserve">las alternativas (como ganancias o pérdidas respecto a un punto de referencia);</w:t>
+      </w:r>
+    </w:p>
+    <w:p>
+      <w:pPr>
+        <w:numPr>
+          <w:ilvl w:val="1"/>
+          <w:numId w:val="1082"/>
+        </w:numPr>
+      </w:pPr>
+      <w:r>
+        <w:t xml:space="preserve">cómo se</w:t>
+      </w:r>
+      <w:r>
+        <w:t xml:space="preserve"> </w:t>
+      </w:r>
+      <w:r>
+        <w:rPr>
+          <w:i/>
+          <w:iCs/>
+        </w:rPr>
+        <w:t xml:space="preserve">valoran</w:t>
+      </w:r>
+      <w:r>
+        <w:t xml:space="preserve"> </w:t>
+      </w:r>
+      <w:r>
+        <w:t xml:space="preserve">(con una función de valor en forma de S);</w:t>
+      </w:r>
+    </w:p>
+    <w:p>
+      <w:pPr>
+        <w:numPr>
+          <w:ilvl w:val="1"/>
+          <w:numId w:val="1082"/>
+        </w:numPr>
+      </w:pPr>
+      <w:r>
+        <w:t xml:space="preserve">y cómo se</w:t>
+      </w:r>
+      <w:r>
+        <w:t xml:space="preserve"> </w:t>
+      </w:r>
+      <w:r>
+        <w:rPr>
+          <w:i/>
+          <w:iCs/>
+        </w:rPr>
+        <w:t xml:space="preserve">ponderan</w:t>
+      </w:r>
+      <w:r>
+        <w:t xml:space="preserve"> </w:t>
+      </w:r>
+      <w:r>
+        <w:t xml:space="preserve">(con pesos de decisión, no con probabilidades).</w:t>
+      </w:r>
+    </w:p>
+    <w:bookmarkEnd w:id="193"/>
+    <w:bookmarkStart w:id="208" w:name="b_modelo_3"/>
+    <w:p>
+      <w:pPr>
+        <w:pStyle w:val="Heading4"/>
+      </w:pPr>
+      <w:r>
+        <w:t xml:space="preserve">b) Modelo</w:t>
+      </w:r>
+    </w:p>
+    <w:bookmarkStart w:id="194" w:name="i_supuestos_3"/>
+    <w:p>
+      <w:pPr>
+        <w:pStyle w:val="Heading5"/>
+      </w:pPr>
+      <w:r>
+        <w:t xml:space="preserve">i) Supuestos</w:t>
+      </w:r>
+    </w:p>
+    <w:p>
+      <w:pPr>
+        <w:keepNext/>
+        <w:numPr>
+          <w:ilvl w:val="0"/>
+          <w:numId w:val="1083"/>
         </w:numPr>
       </w:pPr>
       <w:r>
@@ -28402,7 +28669,7 @@
         <w:keepNext/>
         <w:numPr>
           <w:ilvl w:val="1"/>
-          <w:numId w:val="1078"/>
+          <w:numId w:val="1084"/>
         </w:numPr>
       </w:pPr>
       <w:r>
@@ -28420,7 +28687,7 @@
       <w:pPr>
         <w:numPr>
           <w:ilvl w:val="2"/>
-          <w:numId w:val="1079"/>
+          <w:numId w:val="1085"/>
         </w:numPr>
       </w:pPr>
       <w:r>
@@ -28494,7 +28761,7 @@
       <w:pPr>
         <w:numPr>
           <w:ilvl w:val="2"/>
-          <w:numId w:val="1079"/>
+          <w:numId w:val="1085"/>
         </w:numPr>
       </w:pPr>
       <w:r>
@@ -28553,7 +28820,7 @@
       <w:pPr>
         <w:numPr>
           <w:ilvl w:val="1"/>
-          <w:numId w:val="1078"/>
+          <w:numId w:val="1084"/>
         </w:numPr>
       </w:pPr>
       <w:r>
@@ -28581,7 +28848,7 @@
       <w:pPr>
         <w:numPr>
           <w:ilvl w:val="0"/>
-          <w:numId w:val="1080"/>
+          <w:numId w:val="1086"/>
         </w:numPr>
       </w:pPr>
       <w:r>
@@ -28753,7 +29020,7 @@
       <w:pPr>
         <w:numPr>
           <w:ilvl w:val="0"/>
-          <w:numId w:val="1081"/>
+          <w:numId w:val="1087"/>
         </w:numPr>
       </w:pPr>
       <w:r>
@@ -28941,7 +29208,7 @@
         <w:keepNext/>
         <w:numPr>
           <w:ilvl w:val="0"/>
-          <w:numId w:val="1081"/>
+          <w:numId w:val="1087"/>
         </w:numPr>
       </w:pPr>
       <w:r>
@@ -28973,7 +29240,7 @@
       <w:pPr>
         <w:numPr>
           <w:ilvl w:val="1"/>
-          <w:numId w:val="1082"/>
+          <w:numId w:val="1088"/>
         </w:numPr>
       </w:pPr>
       <w:r>
@@ -28991,7 +29258,7 @@
       <w:pPr>
         <w:numPr>
           <w:ilvl w:val="1"/>
-          <w:numId w:val="1082"/>
+          <w:numId w:val="1088"/>
         </w:numPr>
       </w:pPr>
       <w:r>
@@ -29035,7 +29302,7 @@
       <w:pPr>
         <w:numPr>
           <w:ilvl w:val="1"/>
-          <w:numId w:val="1082"/>
+          <w:numId w:val="1088"/>
         </w:numPr>
       </w:pPr>
       <w:r>
@@ -29564,7 +29831,7 @@
         <w:keepNext/>
         <w:numPr>
           <w:ilvl w:val="0"/>
-          <w:numId w:val="1083"/>
+          <w:numId w:val="1089"/>
         </w:numPr>
       </w:pPr>
       <w:r>
@@ -29645,7 +29912,7 @@
       <w:pPr>
         <w:numPr>
           <w:ilvl w:val="1"/>
-          <w:numId w:val="1084"/>
+          <w:numId w:val="1090"/>
         </w:numPr>
       </w:pPr>
       <m:oMath>
@@ -29733,7 +30000,7 @@
       <w:pPr>
         <w:numPr>
           <w:ilvl w:val="1"/>
-          <w:numId w:val="1084"/>
+          <w:numId w:val="1090"/>
         </w:numPr>
       </w:pPr>
       <w:r>
@@ -29767,7 +30034,7 @@
       <w:pPr>
         <w:numPr>
           <w:ilvl w:val="1"/>
-          <w:numId w:val="1084"/>
+          <w:numId w:val="1090"/>
         </w:numPr>
       </w:pPr>
       <w:r>
@@ -30337,7 +30604,7 @@
         <w:keepNext/>
         <w:numPr>
           <w:ilvl w:val="0"/>
-          <w:numId w:val="1085"/>
+          <w:numId w:val="1091"/>
         </w:numPr>
       </w:pPr>
       <w:r>
@@ -30444,7 +30711,7 @@
       <w:pPr>
         <w:numPr>
           <w:ilvl w:val="1"/>
-          <w:numId w:val="1086"/>
+          <w:numId w:val="1092"/>
         </w:numPr>
       </w:pPr>
       <w:r>
@@ -30498,7 +30765,7 @@
       <w:pPr>
         <w:numPr>
           <w:ilvl w:val="1"/>
-          <w:numId w:val="1086"/>
+          <w:numId w:val="1092"/>
         </w:numPr>
       </w:pPr>
       <w:r>
@@ -30598,7 +30865,7 @@
       <w:pPr>
         <w:numPr>
           <w:ilvl w:val="0"/>
-          <w:numId w:val="1085"/>
+          <w:numId w:val="1091"/>
         </w:numPr>
       </w:pPr>
       <w:r>
@@ -30787,7 +31054,7 @@
       <w:pPr>
         <w:numPr>
           <w:ilvl w:val="0"/>
-          <w:numId w:val="1087"/>
+          <w:numId w:val="1093"/>
         </w:numPr>
       </w:pPr>
       <w:r>
@@ -30883,7 +31150,7 @@
         <w:keepNext/>
         <w:numPr>
           <w:ilvl w:val="0"/>
-          <w:numId w:val="1087"/>
+          <w:numId w:val="1093"/>
         </w:numPr>
       </w:pPr>
       <w:r>
@@ -30915,7 +31182,7 @@
       <w:pPr>
         <w:numPr>
           <w:ilvl w:val="1"/>
-          <w:numId w:val="1088"/>
+          <w:numId w:val="1094"/>
         </w:numPr>
       </w:pPr>
       <w:r>
@@ -31442,7 +31709,7 @@
       <w:pPr>
         <w:numPr>
           <w:ilvl w:val="1"/>
-          <w:numId w:val="1088"/>
+          <w:numId w:val="1094"/>
         </w:numPr>
       </w:pPr>
       <w:r>
@@ -31545,7 +31812,7 @@
       <w:pPr>
         <w:numPr>
           <w:ilvl w:val="1"/>
-          <w:numId w:val="1088"/>
+          <w:numId w:val="1094"/>
         </w:numPr>
       </w:pPr>
       <w:r>
@@ -33076,7 +33343,7 @@
       <w:pPr>
         <w:numPr>
           <w:ilvl w:val="0"/>
-          <w:numId w:val="1089"/>
+          <w:numId w:val="1095"/>
         </w:numPr>
       </w:pPr>
       <w:r>
@@ -33121,7 +33388,7 @@
         <w:keepNext/>
         <w:numPr>
           <w:ilvl w:val="0"/>
-          <w:numId w:val="1089"/>
+          <w:numId w:val="1095"/>
         </w:numPr>
       </w:pPr>
       <w:r>
@@ -33146,7 +33413,7 @@
       <w:pPr>
         <w:numPr>
           <w:ilvl w:val="1"/>
-          <w:numId w:val="1090"/>
+          <w:numId w:val="1096"/>
         </w:numPr>
       </w:pPr>
       <w:r>
@@ -33235,7 +33502,7 @@
       <w:pPr>
         <w:numPr>
           <w:ilvl w:val="1"/>
-          <w:numId w:val="1090"/>
+          <w:numId w:val="1096"/>
         </w:numPr>
       </w:pPr>
       <w:r>
@@ -33305,7 +33572,7 @@
       <w:pPr>
         <w:numPr>
           <w:ilvl w:val="1"/>
-          <w:numId w:val="1090"/>
+          <w:numId w:val="1096"/>
         </w:numPr>
       </w:pPr>
       <w:r>
@@ -33350,7 +33617,7 @@
       <w:pPr>
         <w:numPr>
           <w:ilvl w:val="1"/>
-          <w:numId w:val="1090"/>
+          <w:numId w:val="1096"/>
         </w:numPr>
       </w:pPr>
       <w:r>
@@ -33486,7 +33753,7 @@
         <w:keepLines/>
         <w:numPr>
           <w:ilvl w:val="0"/>
-          <w:numId w:val="1091"/>
+          <w:numId w:val="1097"/>
         </w:numPr>
       </w:pPr>
       <w:r>
@@ -33675,7 +33942,7 @@
         <w:keepLines/>
         <w:numPr>
           <w:ilvl w:val="0"/>
-          <w:numId w:val="1091"/>
+          <w:numId w:val="1097"/>
         </w:numPr>
       </w:pPr>
       <w:r>
@@ -33846,7 +34113,7 @@
         <w:keepLines/>
         <w:numPr>
           <w:ilvl w:val="0"/>
-          <w:numId w:val="1091"/>
+          <w:numId w:val="1097"/>
         </w:numPr>
       </w:pPr>
       <w:r>
@@ -33964,7 +34231,7 @@
         <w:keepLines/>
         <w:numPr>
           <w:ilvl w:val="0"/>
-          <w:numId w:val="1091"/>
+          <w:numId w:val="1097"/>
         </w:numPr>
       </w:pPr>
       <w:r>
@@ -34190,7 +34457,7 @@
       <w:pPr>
         <w:numPr>
           <w:ilvl w:val="0"/>
-          <w:numId w:val="1092"/>
+          <w:numId w:val="1098"/>
         </w:numPr>
       </w:pPr>
       <w:r>
@@ -34315,13 +34582,58 @@
     </w:p>
     <w:p>
       <w:pPr>
+        <w:keepNext/>
         <w:numPr>
           <w:ilvl w:val="0"/>
-          <w:numId w:val="1092"/>
+          <w:numId w:val="1098"/>
         </w:numPr>
       </w:pPr>
       <w:r>
-        <w:t xml:space="preserve">Sus límites: el punto de referencia no está determinado por la teoría (¿la riqueza actual, la esperada, la de los demás?), lo que le da muchos grados de libertad; no tiene la fuerza normativa de la utilidad esperada, y sus aplicaciones a los mercados requieren supuestos sobre cómo se agregan los sesgos individuales. Es un</w:t>
+        <w:t xml:space="preserve">Sus límites:</w:t>
+      </w:r>
+    </w:p>
+    <w:p>
+      <w:pPr>
+        <w:numPr>
+          <w:ilvl w:val="1"/>
+          <w:numId w:val="1099"/>
+        </w:numPr>
+      </w:pPr>
+      <w:r>
+        <w:t xml:space="preserve">el punto de referencia no está determinado por la teoría (¿la riqueza actual, la esperada, la de los demás?), lo que le da muchos grados de libertad;</w:t>
+      </w:r>
+    </w:p>
+    <w:p>
+      <w:pPr>
+        <w:numPr>
+          <w:ilvl w:val="1"/>
+          <w:numId w:val="1099"/>
+        </w:numPr>
+      </w:pPr>
+      <w:r>
+        <w:t xml:space="preserve">no tiene la fuerza normativa de la utilidad esperada;</w:t>
+      </w:r>
+    </w:p>
+    <w:p>
+      <w:pPr>
+        <w:numPr>
+          <w:ilvl w:val="1"/>
+          <w:numId w:val="1099"/>
+        </w:numPr>
+      </w:pPr>
+      <w:r>
+        <w:t xml:space="preserve">y sus aplicaciones a los mercados requieren supuestos sobre cómo se agregan los sesgos individuales.</w:t>
+      </w:r>
+    </w:p>
+    <w:p>
+      <w:pPr>
+        <w:numPr>
+          <w:ilvl w:val="0"/>
+          <w:numId w:val="1098"/>
+        </w:numPr>
+      </w:pPr>
+      <w:r>
+        <w:t xml:space="preserve">Es un</w:t>
       </w:r>
       <w:r>
         <w:t xml:space="preserve"> </w:t>
@@ -34362,7 +34674,7 @@
       <w:pPr>
         <w:numPr>
           <w:ilvl w:val="0"/>
-          <w:numId w:val="1093"/>
+          <w:numId w:val="1100"/>
         </w:numPr>
       </w:pPr>
       <w:r>
@@ -34407,7 +34719,7 @@
       <w:pPr>
         <w:numPr>
           <w:ilvl w:val="0"/>
-          <w:numId w:val="1094"/>
+          <w:numId w:val="1101"/>
         </w:numPr>
       </w:pPr>
       <w:r>
@@ -34638,7 +34950,7 @@
       <w:pPr>
         <w:numPr>
           <w:ilvl w:val="0"/>
-          <w:numId w:val="1095"/>
+          <w:numId w:val="1102"/>
         </w:numPr>
       </w:pPr>
       <w:r>
@@ -34691,7 +35003,7 @@
       <w:pPr>
         <w:numPr>
           <w:ilvl w:val="0"/>
-          <w:numId w:val="1095"/>
+          <w:numId w:val="1102"/>
         </w:numPr>
       </w:pPr>
       <w:r>
@@ -34735,7 +35047,7 @@
         <w:keepNext/>
         <w:numPr>
           <w:ilvl w:val="0"/>
-          <w:numId w:val="1096"/>
+          <w:numId w:val="1103"/>
         </w:numPr>
       </w:pPr>
       <w:r>
@@ -34870,7 +35182,7 @@
       <w:pPr>
         <w:numPr>
           <w:ilvl w:val="1"/>
-          <w:numId w:val="1097"/>
+          <w:numId w:val="1104"/>
         </w:numPr>
       </w:pPr>
       <w:r>
@@ -34911,7 +35223,7 @@
       <w:pPr>
         <w:numPr>
           <w:ilvl w:val="1"/>
-          <w:numId w:val="1097"/>
+          <w:numId w:val="1104"/>
         </w:numPr>
       </w:pPr>
       <w:r>
@@ -34948,7 +35260,7 @@
       <w:pPr>
         <w:numPr>
           <w:ilvl w:val="1"/>
-          <w:numId w:val="1097"/>
+          <w:numId w:val="1104"/>
         </w:numPr>
       </w:pPr>
       <w:r>
@@ -34957,13 +35269,47 @@
     </w:p>
     <w:p>
       <w:pPr>
+        <w:keepNext/>
         <w:numPr>
           <w:ilvl w:val="1"/>
-          <w:numId w:val="1097"/>
+          <w:numId w:val="1104"/>
         </w:numPr>
       </w:pPr>
       <w:r>
-        <w:t xml:space="preserve">P5 a P7: no todo es indiferente; los sucesos se pueden partir en otros tan poco probables como se quiera (una forma de continuidad), y una condición técnica para infinitos resultados.</w:t>
+        <w:t xml:space="preserve">P5 a P7:</w:t>
+      </w:r>
+    </w:p>
+    <w:p>
+      <w:pPr>
+        <w:numPr>
+          <w:ilvl w:val="2"/>
+          <w:numId w:val="1105"/>
+        </w:numPr>
+      </w:pPr>
+      <w:r>
+        <w:t xml:space="preserve">no todo es indiferente;</w:t>
+      </w:r>
+    </w:p>
+    <w:p>
+      <w:pPr>
+        <w:numPr>
+          <w:ilvl w:val="2"/>
+          <w:numId w:val="1105"/>
+        </w:numPr>
+      </w:pPr>
+      <w:r>
+        <w:t xml:space="preserve">los sucesos se pueden partir en otros tan poco probables como se quiera (una forma de continuidad);</w:t>
+      </w:r>
+    </w:p>
+    <w:p>
+      <w:pPr>
+        <w:numPr>
+          <w:ilvl w:val="2"/>
+          <w:numId w:val="1105"/>
+        </w:numPr>
+      </w:pPr>
+      <w:r>
+        <w:t xml:space="preserve">y una condición técnica para infinitos resultados.</w:t>
       </w:r>
     </w:p>
     <w:bookmarkEnd w:id="216"/>
@@ -34980,7 +35326,7 @@
       <w:pPr>
         <w:numPr>
           <w:ilvl w:val="0"/>
-          <w:numId w:val="1098"/>
+          <w:numId w:val="1106"/>
         </w:numPr>
       </w:pPr>
       <w:r>
@@ -35368,7 +35714,7 @@
       <w:pPr>
         <w:numPr>
           <w:ilvl w:val="0"/>
-          <w:numId w:val="1099"/>
+          <w:numId w:val="1107"/>
         </w:numPr>
       </w:pPr>
       <w:r>
@@ -35417,7 +35763,7 @@
       <w:pPr>
         <w:numPr>
           <w:ilvl w:val="0"/>
-          <w:numId w:val="1099"/>
+          <w:numId w:val="1107"/>
         </w:numPr>
       </w:pPr>
       <w:r>
@@ -35462,7 +35808,7 @@
       <w:pPr>
         <w:numPr>
           <w:ilvl w:val="0"/>
-          <w:numId w:val="1100"/>
+          <w:numId w:val="1108"/>
         </w:numPr>
       </w:pPr>
       <w:r>
@@ -35800,7 +36146,7 @@
       <w:pPr>
         <w:numPr>
           <w:ilvl w:val="0"/>
-          <w:numId w:val="1101"/>
+          <w:numId w:val="1109"/>
         </w:numPr>
       </w:pPr>
       <w:r>
@@ -35877,7 +36223,7 @@
       <w:pPr>
         <w:numPr>
           <w:ilvl w:val="0"/>
-          <w:numId w:val="1101"/>
+          <w:numId w:val="1109"/>
         </w:numPr>
       </w:pPr>
       <w:r>
@@ -36008,7 +36354,7 @@
       <w:pPr>
         <w:numPr>
           <w:ilvl w:val="0"/>
-          <w:numId w:val="1101"/>
+          <w:numId w:val="1109"/>
         </w:numPr>
       </w:pPr>
       <w:r>
@@ -36115,7 +36461,7 @@
       <w:pPr>
         <w:numPr>
           <w:ilvl w:val="0"/>
-          <w:numId w:val="1101"/>
+          <w:numId w:val="1109"/>
         </w:numPr>
       </w:pPr>
       <w:r>
@@ -36343,7 +36689,7 @@
       <w:pPr>
         <w:numPr>
           <w:ilvl w:val="0"/>
-          <w:numId w:val="1102"/>
+          <w:numId w:val="1110"/>
         </w:numPr>
       </w:pPr>
       <w:r>
@@ -36441,7 +36787,7 @@
       <w:pPr>
         <w:numPr>
           <w:ilvl w:val="0"/>
-          <w:numId w:val="1103"/>
+          <w:numId w:val="1111"/>
         </w:numPr>
       </w:pPr>
       <w:r>
@@ -36722,7 +37068,7 @@
       <w:pPr>
         <w:numPr>
           <w:ilvl w:val="1"/>
-          <w:numId w:val="1104"/>
+          <w:numId w:val="1112"/>
         </w:numPr>
       </w:pPr>
       <w:r>
@@ -36977,7 +37323,7 @@
       <w:pPr>
         <w:numPr>
           <w:ilvl w:val="1"/>
-          <w:numId w:val="1104"/>
+          <w:numId w:val="1112"/>
         </w:numPr>
       </w:pPr>
       <w:r>
@@ -37052,7 +37398,7 @@
       <w:pPr>
         <w:numPr>
           <w:ilvl w:val="0"/>
-          <w:numId w:val="1103"/>
+          <w:numId w:val="1111"/>
         </w:numPr>
       </w:pPr>
       <w:r>
@@ -37391,7 +37737,7 @@
       <w:pPr>
         <w:numPr>
           <w:ilvl w:val="0"/>
-          <w:numId w:val="1103"/>
+          <w:numId w:val="1111"/>
         </w:numPr>
       </w:pPr>
       <w:r>
@@ -37800,7 +38146,7 @@
         <w:keepNext/>
         <w:numPr>
           <w:ilvl w:val="0"/>
-          <w:numId w:val="1105"/>
+          <w:numId w:val="1113"/>
         </w:numPr>
       </w:pPr>
       <w:r>
@@ -37874,7 +38220,7 @@
       <w:pPr>
         <w:numPr>
           <w:ilvl w:val="1"/>
-          <w:numId w:val="1106"/>
+          <w:numId w:val="1114"/>
         </w:numPr>
       </w:pPr>
       <w:r>
@@ -37964,7 +38310,7 @@
       <w:pPr>
         <w:numPr>
           <w:ilvl w:val="1"/>
-          <w:numId w:val="1106"/>
+          <w:numId w:val="1114"/>
         </w:numPr>
       </w:pPr>
       <w:r>
@@ -37996,7 +38342,7 @@
       <w:pPr>
         <w:numPr>
           <w:ilvl w:val="1"/>
-          <w:numId w:val="1106"/>
+          <w:numId w:val="1114"/>
         </w:numPr>
       </w:pPr>
       <w:r>
@@ -38043,7 +38389,7 @@
       <w:pPr>
         <w:numPr>
           <w:ilvl w:val="1"/>
-          <w:numId w:val="1106"/>
+          <w:numId w:val="1114"/>
         </w:numPr>
       </w:pPr>
       <w:r>
@@ -38408,7 +38754,7 @@
       <w:pPr>
         <w:numPr>
           <w:ilvl w:val="1"/>
-          <w:numId w:val="1106"/>
+          <w:numId w:val="1114"/>
         </w:numPr>
       </w:pPr>
       <w:r>
@@ -39708,9 +40054,10 @@
     </w:p>
     <w:p>
       <w:pPr>
+        <w:keepNext/>
         <w:numPr>
           <w:ilvl w:val="0"/>
-          <w:numId w:val="1107"/>
+          <w:numId w:val="1115"/>
         </w:numPr>
       </w:pPr>
       <w:r>
@@ -39743,9 +40090,14 @@
       <w:r>
         <w:t xml:space="preserve">:</w:t>
       </w:r>
-      <w:r>
-        <w:t xml:space="preserve"> </w:t>
-      </w:r>
+    </w:p>
+    <w:p>
+      <w:pPr>
+        <w:numPr>
+          <w:ilvl w:val="1"/>
+          <w:numId w:val="1116"/>
+        </w:numPr>
+      </w:pPr>
       <w:r>
         <w:rPr>
           <w:smallCaps/>
@@ -39758,9 +40110,14 @@
       <w:r>
         <w:t xml:space="preserve">y maximax solo miran un resultado por acción;</w:t>
       </w:r>
-      <w:r>
-        <w:t xml:space="preserve"> </w:t>
-      </w:r>
+    </w:p>
+    <w:p>
+      <w:pPr>
+        <w:numPr>
+          <w:ilvl w:val="1"/>
+          <w:numId w:val="1116"/>
+        </w:numPr>
+      </w:pPr>
       <w:r>
         <w:rPr>
           <w:smallCaps/>
@@ -39771,7 +40128,18 @@
         <w:t xml:space="preserve"> </w:t>
       </w:r>
       <w:r>
-        <w:t xml:space="preserve">depende de cómo se cuenten los estados (partir uno en 2 cambia las probabilidades), y el de</w:t>
+        <w:t xml:space="preserve">depende de cómo se cuenten los estados (partir uno en 2 cambia las probabilidades);</w:t>
+      </w:r>
+    </w:p>
+    <w:p>
+      <w:pPr>
+        <w:numPr>
+          <w:ilvl w:val="1"/>
+          <w:numId w:val="1116"/>
+        </w:numPr>
+      </w:pPr>
+      <w:r>
+        <w:t xml:space="preserve">y el de</w:t>
       </w:r>
       <w:r>
         <w:t xml:space="preserve"> </w:t>
@@ -39799,14 +40167,25 @@
         <w:t xml:space="preserve">independencia de las alternativas irrelevantes</w:t>
       </w:r>
       <w:r>
-        <w:t xml:space="preserve">: añadir una acción que nadie elegiría puede cambiar los pesares y la elección entre las demás. Son reglas prácticas para la ignorancia completa, no una teoría de las preferencias; los modelos de ambigüedad son su versión axiomática.</w:t>
+        <w:t xml:space="preserve">: añadir una acción que nadie elegiría puede cambiar los pesares y la elección entre las demás.</w:t>
       </w:r>
     </w:p>
     <w:p>
       <w:pPr>
         <w:numPr>
           <w:ilvl w:val="0"/>
-          <w:numId w:val="1107"/>
+          <w:numId w:val="1115"/>
+        </w:numPr>
+      </w:pPr>
+      <w:r>
+        <w:t xml:space="preserve">Son reglas prácticas para la ignorancia completa, no una teoría de las preferencias; los modelos de ambigüedad son su versión axiomática.</w:t>
+      </w:r>
+    </w:p>
+    <w:p>
+      <w:pPr>
+        <w:numPr>
+          <w:ilvl w:val="0"/>
+          <w:numId w:val="1115"/>
         </w:numPr>
       </w:pPr>
       <w:r>
@@ -39966,7 +40345,7 @@
       <w:pPr>
         <w:numPr>
           <w:ilvl w:val="0"/>
-          <w:numId w:val="1108"/>
+          <w:numId w:val="1117"/>
         </w:numPr>
       </w:pPr>
       <w:r>
@@ -40006,7 +40385,7 @@
         <w:keepNext/>
         <w:numPr>
           <w:ilvl w:val="0"/>
-          <w:numId w:val="1109"/>
+          <w:numId w:val="1118"/>
         </w:numPr>
       </w:pPr>
       <w:r>
@@ -40026,7 +40405,7 @@
       <w:pPr>
         <w:numPr>
           <w:ilvl w:val="1"/>
-          <w:numId w:val="1110"/>
+          <w:numId w:val="1119"/>
         </w:numPr>
       </w:pPr>
       <w:r>
@@ -40060,7 +40439,7 @@
       <w:pPr>
         <w:numPr>
           <w:ilvl w:val="1"/>
-          <w:numId w:val="1110"/>
+          <w:numId w:val="1119"/>
         </w:numPr>
       </w:pPr>
       <w:r>
@@ -40089,43 +40468,14 @@
     </w:p>
     <w:p>
       <w:pPr>
+        <w:keepNext/>
         <w:numPr>
           <w:ilvl w:val="1"/>
-          <w:numId w:val="1110"/>
+          <w:numId w:val="1119"/>
         </w:numPr>
       </w:pPr>
       <w:r>
-        <w:t xml:space="preserve">Cuando las probabilidades no se conocen,</w:t>
-      </w:r>
-      <w:r>
-        <w:t xml:space="preserve"> </w:t>
-      </w:r>
-      <w:r>
-        <w:rPr>
-          <w:smallCaps/>
-        </w:rPr>
-        <w:t xml:space="preserve">Savage</w:t>
-      </w:r>
-      <w:r>
-        <w:t xml:space="preserve"> </w:t>
-      </w:r>
-      <w:r>
-        <w:t xml:space="preserve">muestra que se puede actuar como si se tuvieran;</w:t>
-      </w:r>
-      <w:r>
-        <w:t xml:space="preserve"> </w:t>
-      </w:r>
-      <w:r>
-        <w:rPr>
-          <w:smallCaps/>
-        </w:rPr>
-        <w:t xml:space="preserve">Ellsberg</w:t>
-      </w:r>
-      <w:r>
-        <w:t xml:space="preserve"> </w:t>
-      </w:r>
-      <w:r>
-        <w:t xml:space="preserve">muestra que la gente rechaza la ambigüedad, y los modelos de previos múltiples lo acomodan (</w:t>
+        <w:t xml:space="preserve">Cuando las probabilidades no se conocen (</w:t>
       </w:r>
       <w:hyperlink w:anchor="sec_incertidumbre">
         <w:r>
@@ -40136,14 +40486,66 @@
         </w:r>
       </w:hyperlink>
       <w:r>
-        <w:t xml:space="preserve">).</w:t>
-      </w:r>
-    </w:p>
-    <w:p>
-      <w:pPr>
+        <w:t xml:space="preserve">):</w:t>
+      </w:r>
+    </w:p>
+    <w:p>
+      <w:pPr>
+        <w:numPr>
+          <w:ilvl w:val="2"/>
+          <w:numId w:val="1120"/>
+        </w:numPr>
+      </w:pPr>
+      <w:r>
+        <w:rPr>
+          <w:smallCaps/>
+        </w:rPr>
+        <w:t xml:space="preserve">Savage</w:t>
+      </w:r>
+      <w:r>
+        <w:t xml:space="preserve"> </w:t>
+      </w:r>
+      <w:r>
+        <w:t xml:space="preserve">muestra que se puede actuar como si se tuvieran;</w:t>
+      </w:r>
+    </w:p>
+    <w:p>
+      <w:pPr>
+        <w:numPr>
+          <w:ilvl w:val="2"/>
+          <w:numId w:val="1120"/>
+        </w:numPr>
+      </w:pPr>
+      <w:r>
+        <w:rPr>
+          <w:smallCaps/>
+        </w:rPr>
+        <w:t xml:space="preserve">Ellsberg</w:t>
+      </w:r>
+      <w:r>
+        <w:t xml:space="preserve"> </w:t>
+      </w:r>
+      <w:r>
+        <w:t xml:space="preserve">muestra que la gente rechaza la ambigüedad;</w:t>
+      </w:r>
+    </w:p>
+    <w:p>
+      <w:pPr>
+        <w:numPr>
+          <w:ilvl w:val="2"/>
+          <w:numId w:val="1120"/>
+        </w:numPr>
+      </w:pPr>
+      <w:r>
+        <w:t xml:space="preserve">y los modelos de previos múltiples lo acomodan.</w:t>
+      </w:r>
+    </w:p>
+    <w:p>
+      <w:pPr>
+        <w:keepNext/>
         <w:numPr>
           <w:ilvl w:val="0"/>
-          <w:numId w:val="1109"/>
+          <w:numId w:val="1118"/>
         </w:numPr>
       </w:pPr>
       <w:r>
@@ -40156,7 +40558,18 @@
         <w:t xml:space="preserve">Relevancia</w:t>
       </w:r>
       <w:r>
-        <w:t xml:space="preserve">: la utilidad esperada es el lenguaje en que se escriben la teoría de carteras</w:t>
+        <w:t xml:space="preserve">: la utilidad esperada es el lenguaje en que se escriben:</w:t>
+      </w:r>
+    </w:p>
+    <w:p>
+      <w:pPr>
+        <w:numPr>
+          <w:ilvl w:val="1"/>
+          <w:numId w:val="1121"/>
+        </w:numPr>
+      </w:pPr>
+      <w:r>
+        <w:t xml:space="preserve">la teoría de carteras</w:t>
       </w:r>
       <w:r>
         <w:t xml:space="preserve"> </w:t>
@@ -40170,7 +40583,18 @@
         </w:r>
       </w:hyperlink>
       <w:r>
-        <w:t xml:space="preserve">, la demanda de dinero como activo</w:t>
+        <w:t xml:space="preserve">;</w:t>
+      </w:r>
+    </w:p>
+    <w:p>
+      <w:pPr>
+        <w:numPr>
+          <w:ilvl w:val="1"/>
+          <w:numId w:val="1121"/>
+        </w:numPr>
+      </w:pPr>
+      <w:r>
+        <w:t xml:space="preserve">la demanda de dinero como activo</w:t>
       </w:r>
       <w:r>
         <w:t xml:space="preserve"> </w:t>
@@ -40184,7 +40608,18 @@
         </w:r>
       </w:hyperlink>
       <w:r>
-        <w:t xml:space="preserve">, los seguros y los contratos con información asimétrica</w:t>
+        <w:t xml:space="preserve">;</w:t>
+      </w:r>
+    </w:p>
+    <w:p>
+      <w:pPr>
+        <w:numPr>
+          <w:ilvl w:val="1"/>
+          <w:numId w:val="1121"/>
+        </w:numPr>
+      </w:pPr>
+      <w:r>
+        <w:t xml:space="preserve">los seguros y los contratos con información asimétrica</w:t>
       </w:r>
       <w:r>
         <w:t xml:space="preserve"> </w:t>
@@ -40198,8 +40633,16 @@
         </w:r>
       </w:hyperlink>
       <w:r>
-        <w:t xml:space="preserve"> </w:t>
-      </w:r>
+        <w:t xml:space="preserve">;</w:t>
+      </w:r>
+    </w:p>
+    <w:p>
+      <w:pPr>
+        <w:numPr>
+          <w:ilvl w:val="1"/>
+          <w:numId w:val="1121"/>
+        </w:numPr>
+      </w:pPr>
       <w:r>
         <w:t xml:space="preserve">y los juegos con estrategias mixtas y las subastas</w:t>
       </w:r>
@@ -40215,7 +40658,18 @@
         </w:r>
       </w:hyperlink>
       <w:r>
-        <w:t xml:space="preserve">; y justifica la regulación que protege a quien no puede diversificar, como los seguros obligatorios o la garantía de depósitos (anexo </w:t>
+        <w:t xml:space="preserve">.</w:t>
+      </w:r>
+    </w:p>
+    <w:p>
+      <w:pPr>
+        <w:numPr>
+          <w:ilvl w:val="0"/>
+          <w:numId w:val="1000"/>
+        </w:numPr>
+      </w:pPr>
+      <w:r>
+        <w:t xml:space="preserve">Y justifica la regulación que protege a quien no puede diversificar, como los seguros obligatorios o la garantía de depósitos (anexo </w:t>
       </w:r>
       <w:hyperlink w:anchor="anexo_diamond_dybvig">
         <w:r>
@@ -40248,7 +40702,7 @@
         <w:keepNext/>
         <w:numPr>
           <w:ilvl w:val="0"/>
-          <w:numId w:val="1109"/>
+          <w:numId w:val="1118"/>
         </w:numPr>
       </w:pPr>
       <w:r>
@@ -40268,7 +40722,7 @@
       <w:pPr>
         <w:numPr>
           <w:ilvl w:val="1"/>
-          <w:numId w:val="1111"/>
+          <w:numId w:val="1122"/>
         </w:numPr>
       </w:pPr>
       <w:r>
@@ -40320,13 +40774,25 @@
     </w:p>
     <w:p>
       <w:pPr>
+        <w:keepNext/>
         <w:numPr>
           <w:ilvl w:val="1"/>
-          <w:numId w:val="1111"/>
+          <w:numId w:val="1122"/>
         </w:numPr>
       </w:pPr>
       <w:r>
-        <w:t xml:space="preserve">En macroeconomía, la aversión relativa constante fija también la elasticidad de sustitución intertemporal</w:t>
+        <w:t xml:space="preserve">En macroeconomía:</w:t>
+      </w:r>
+    </w:p>
+    <w:p>
+      <w:pPr>
+        <w:numPr>
+          <w:ilvl w:val="2"/>
+          <w:numId w:val="1123"/>
+        </w:numPr>
+      </w:pPr>
+      <w:r>
+        <w:t xml:space="preserve">la aversión relativa constante fija también la elasticidad de sustitución intertemporal</w:t>
       </w:r>
       <w:r>
         <w:t xml:space="preserve"> </w:t>
@@ -40340,7 +40806,18 @@
         </w:r>
       </w:hyperlink>
       <w:r>
-        <w:t xml:space="preserve">; la prudencia explica el ahorro precautorio que el paseo aleatorio de</w:t>
+        <w:t xml:space="preserve">;</w:t>
+      </w:r>
+    </w:p>
+    <w:p>
+      <w:pPr>
+        <w:numPr>
+          <w:ilvl w:val="2"/>
+          <w:numId w:val="1123"/>
+        </w:numPr>
+      </w:pPr>
+      <w:r>
+        <w:t xml:space="preserve">la prudencia explica el ahorro precautorio que el paseo aleatorio de</w:t>
       </w:r>
       <w:r>
         <w:t xml:space="preserve"> </w:t>
@@ -40369,7 +40846,18 @@
         </w:r>
       </w:hyperlink>
       <w:r>
-        <w:t xml:space="preserve">, y la incertidumbre y la irreversibilidad retrasan la inversión</w:t>
+        <w:t xml:space="preserve">;</w:t>
+      </w:r>
+    </w:p>
+    <w:p>
+      <w:pPr>
+        <w:numPr>
+          <w:ilvl w:val="2"/>
+          <w:numId w:val="1123"/>
+        </w:numPr>
+      </w:pPr>
+      <w:r>
+        <w:t xml:space="preserve">y la incertidumbre y la irreversibilidad retrasan la inversión</w:t>
       </w:r>
       <w:r>
         <w:t xml:space="preserve"> </w:t>
@@ -40383,7 +40871,18 @@
         </w:r>
       </w:hyperlink>
       <w:r>
-        <w:t xml:space="preserve">. La aversión a la ambigüedad inspira la política monetaria robusta de</w:t>
+        <w:t xml:space="preserve">.</w:t>
+      </w:r>
+    </w:p>
+    <w:p>
+      <w:pPr>
+        <w:numPr>
+          <w:ilvl w:val="1"/>
+          <w:numId w:val="1122"/>
+        </w:numPr>
+      </w:pPr>
+      <w:r>
+        <w:t xml:space="preserve">La aversión a la ambigüedad inspira la política monetaria robusta de</w:t>
       </w:r>
       <w:r>
         <w:t xml:space="preserve"> </w:t>
@@ -40417,7 +40916,7 @@
       <w:pPr>
         <w:numPr>
           <w:ilvl w:val="0"/>
-          <w:numId w:val="1109"/>
+          <w:numId w:val="1118"/>
         </w:numPr>
       </w:pPr>
       <w:r>
@@ -40463,7 +40962,7 @@
       <w:pPr>
         <w:numPr>
           <w:ilvl w:val="0"/>
-          <w:numId w:val="1109"/>
+          <w:numId w:val="1118"/>
         </w:numPr>
       </w:pPr>
       <w:r>
@@ -40584,7 +41083,7 @@
       <w:pPr>
         <w:numPr>
           <w:ilvl w:val="0"/>
-          <w:numId w:val="1112"/>
+          <w:numId w:val="1124"/>
         </w:numPr>
       </w:pPr>
       <w:r>
@@ -41339,7 +41838,7 @@
       <w:pPr>
         <w:numPr>
           <w:ilvl w:val="0"/>
-          <w:numId w:val="1113"/>
+          <w:numId w:val="1125"/>
         </w:numPr>
       </w:pPr>
       <w:r>
@@ -41558,7 +42057,7 @@
       <w:pPr>
         <w:numPr>
           <w:ilvl w:val="0"/>
-          <w:numId w:val="1113"/>
+          <w:numId w:val="1125"/>
         </w:numPr>
       </w:pPr>
       <w:r>
@@ -41770,7 +42269,7 @@
       <w:pPr>
         <w:numPr>
           <w:ilvl w:val="0"/>
-          <w:numId w:val="1113"/>
+          <w:numId w:val="1125"/>
         </w:numPr>
       </w:pPr>
       <w:r>
@@ -41905,7 +42404,7 @@
       <w:pPr>
         <w:numPr>
           <w:ilvl w:val="0"/>
-          <w:numId w:val="1114"/>
+          <w:numId w:val="1126"/>
         </w:numPr>
       </w:pPr>
       <w:r>
@@ -41959,7 +42458,7 @@
       <w:pPr>
         <w:numPr>
           <w:ilvl w:val="0"/>
-          <w:numId w:val="1114"/>
+          <w:numId w:val="1126"/>
         </w:numPr>
       </w:pPr>
       <w:r>
@@ -41970,7 +42469,7 @@
       <w:pPr>
         <w:numPr>
           <w:ilvl w:val="0"/>
-          <w:numId w:val="1114"/>
+          <w:numId w:val="1126"/>
         </w:numPr>
       </w:pPr>
       <w:r>
@@ -42043,7 +42542,7 @@
       <w:pPr>
         <w:numPr>
           <w:ilvl w:val="0"/>
-          <w:numId w:val="1115"/>
+          <w:numId w:val="1127"/>
         </w:numPr>
       </w:pPr>
       <w:r>
@@ -42183,7 +42682,7 @@
       <w:pPr>
         <w:numPr>
           <w:ilvl w:val="0"/>
-          <w:numId w:val="1115"/>
+          <w:numId w:val="1127"/>
         </w:numPr>
       </w:pPr>
       <w:r>
@@ -42257,7 +42756,7 @@
       <w:pPr>
         <w:numPr>
           <w:ilvl w:val="0"/>
-          <w:numId w:val="1115"/>
+          <w:numId w:val="1127"/>
         </w:numPr>
       </w:pPr>
       <w:r>
@@ -42570,7 +43069,7 @@
       <w:pPr>
         <w:numPr>
           <w:ilvl w:val="0"/>
-          <w:numId w:val="1116"/>
+          <w:numId w:val="1128"/>
         </w:numPr>
       </w:pPr>
       <w:r>
@@ -42709,7 +43208,7 @@
       <w:pPr>
         <w:numPr>
           <w:ilvl w:val="0"/>
-          <w:numId w:val="1116"/>
+          <w:numId w:val="1128"/>
         </w:numPr>
       </w:pPr>
       <w:r>
@@ -43075,7 +43574,7 @@
       <w:pPr>
         <w:numPr>
           <w:ilvl w:val="0"/>
-          <w:numId w:val="1116"/>
+          <w:numId w:val="1128"/>
         </w:numPr>
       </w:pPr>
       <w:r>
@@ -43204,7 +43703,7 @@
       <w:pPr>
         <w:numPr>
           <w:ilvl w:val="0"/>
-          <w:numId w:val="1116"/>
+          <w:numId w:val="1128"/>
         </w:numPr>
       </w:pPr>
       <w:r>
@@ -43892,7 +44391,7 @@
       <w:pPr>
         <w:numPr>
           <w:ilvl w:val="0"/>
-          <w:numId w:val="1116"/>
+          <w:numId w:val="1128"/>
         </w:numPr>
       </w:pPr>
       <w:r>
@@ -44543,7 +45042,7 @@
       <w:pPr>
         <w:numPr>
           <w:ilvl w:val="0"/>
-          <w:numId w:val="1117"/>
+          <w:numId w:val="1129"/>
         </w:numPr>
       </w:pPr>
       <w:r>
@@ -44783,7 +45282,7 @@
       <w:pPr>
         <w:numPr>
           <w:ilvl w:val="0"/>
-          <w:numId w:val="1118"/>
+          <w:numId w:val="1130"/>
         </w:numPr>
       </w:pPr>
       <w:r>
@@ -44813,7 +45312,7 @@
       <w:pPr>
         <w:numPr>
           <w:ilvl w:val="0"/>
-          <w:numId w:val="1119"/>
+          <w:numId w:val="1131"/>
         </w:numPr>
       </w:pPr>
       <w:r>
@@ -44945,7 +45444,7 @@
       <w:pPr>
         <w:numPr>
           <w:ilvl w:val="0"/>
-          <w:numId w:val="1119"/>
+          <w:numId w:val="1131"/>
         </w:numPr>
       </w:pPr>
       <w:r>
@@ -44971,7 +45470,7 @@
       <w:pPr>
         <w:numPr>
           <w:ilvl w:val="0"/>
-          <w:numId w:val="1119"/>
+          <w:numId w:val="1131"/>
         </w:numPr>
       </w:pPr>
       <w:r>
@@ -45133,7 +45632,7 @@
       <w:pPr>
         <w:numPr>
           <w:ilvl w:val="0"/>
-          <w:numId w:val="1120"/>
+          <w:numId w:val="1132"/>
         </w:numPr>
       </w:pPr>
       <w:r>
@@ -45668,7 +46167,7 @@
       <w:pPr>
         <w:numPr>
           <w:ilvl w:val="0"/>
-          <w:numId w:val="1120"/>
+          <w:numId w:val="1132"/>
         </w:numPr>
       </w:pPr>
       <w:r>
@@ -46391,7 +46890,7 @@
         <w:keepNext/>
         <w:numPr>
           <w:ilvl w:val="0"/>
-          <w:numId w:val="1121"/>
+          <w:numId w:val="1133"/>
         </w:numPr>
       </w:pPr>
       <w:r>
@@ -46468,7 +46967,7 @@
       <w:pPr>
         <w:numPr>
           <w:ilvl w:val="1"/>
-          <w:numId w:val="1122"/>
+          <w:numId w:val="1134"/>
         </w:numPr>
       </w:pPr>
       <w:r>
@@ -46557,7 +47056,7 @@
       <w:pPr>
         <w:numPr>
           <w:ilvl w:val="1"/>
-          <w:numId w:val="1122"/>
+          <w:numId w:val="1134"/>
         </w:numPr>
       </w:pPr>
       <w:r>
@@ -46817,7 +47316,7 @@
       <w:pPr>
         <w:numPr>
           <w:ilvl w:val="0"/>
-          <w:numId w:val="1123"/>
+          <w:numId w:val="1135"/>
         </w:numPr>
       </w:pPr>
       <w:r>
@@ -46906,9 +47405,10 @@
     </w:p>
     <w:p>
       <w:pPr>
+        <w:keepNext/>
         <w:numPr>
           <w:ilvl w:val="0"/>
-          <w:numId w:val="1123"/>
+          <w:numId w:val="1135"/>
         </w:numPr>
       </w:pPr>
       <w:r>
@@ -46933,7 +47433,18 @@
         </w:r>
       </w:hyperlink>
       <w:r>
-        <w:t xml:space="preserve">, derecha): si la aversión absoluta es decreciente (DARA),</w:t>
+        <w:t xml:space="preserve">, derecha):</w:t>
+      </w:r>
+    </w:p>
+    <w:p>
+      <w:pPr>
+        <w:numPr>
+          <w:ilvl w:val="1"/>
+          <w:numId w:val="1136"/>
+        </w:numPr>
+      </w:pPr>
+      <w:r>
+        <w:t xml:space="preserve">si la aversión absoluta es decreciente (DARA),</w:t>
       </w:r>
       <w:r>
         <w:t xml:space="preserve"> </w:t>
@@ -46990,7 +47501,18 @@
         <w:t xml:space="preserve">bien normal</w:t>
       </w:r>
       <w:r>
-        <w:t xml:space="preserve">. Si es constante (CARA),</w:t>
+        <w:t xml:space="preserve">;</w:t>
+      </w:r>
+    </w:p>
+    <w:p>
+      <w:pPr>
+        <w:numPr>
+          <w:ilvl w:val="1"/>
+          <w:numId w:val="1136"/>
+        </w:numPr>
+      </w:pPr>
+      <w:r>
+        <w:t xml:space="preserve">si es constante (CARA),</w:t>
       </w:r>
       <w:r>
         <w:t xml:space="preserve"> </w:t>
@@ -47016,7 +47538,29 @@
         <w:t xml:space="preserve"> </w:t>
       </w:r>
       <w:r>
-        <w:t xml:space="preserve">no depende de la riqueza, y si es creciente (IARA, como la cuadrática), disminuye con ella: el activo con riesgo sería un bien inferior, lo que contradice la evidencia. Si la relativa es constante (CRRA), la</w:t>
+        <w:t xml:space="preserve">no depende de la riqueza;</w:t>
+      </w:r>
+    </w:p>
+    <w:p>
+      <w:pPr>
+        <w:numPr>
+          <w:ilvl w:val="1"/>
+          <w:numId w:val="1136"/>
+        </w:numPr>
+      </w:pPr>
+      <w:r>
+        <w:t xml:space="preserve">si es creciente (IARA, como la cuadrática), disminuye con ella: el activo con riesgo sería un bien inferior, lo que contradice la evidencia;</w:t>
+      </w:r>
+    </w:p>
+    <w:p>
+      <w:pPr>
+        <w:numPr>
+          <w:ilvl w:val="1"/>
+          <w:numId w:val="1136"/>
+        </w:numPr>
+      </w:pPr>
+      <w:r>
+        <w:t xml:space="preserve">si la relativa es constante (CRRA), la</w:t>
       </w:r>
       <w:r>
         <w:t xml:space="preserve"> </w:t>
@@ -47078,7 +47622,7 @@
       <w:pPr>
         <w:numPr>
           <w:ilvl w:val="0"/>
-          <w:numId w:val="1123"/>
+          <w:numId w:val="1135"/>
         </w:numPr>
       </w:pPr>
       <w:r>
@@ -47559,7 +48103,7 @@
       <w:pPr>
         <w:numPr>
           <w:ilvl w:val="1"/>
-          <w:numId w:val="1124"/>
+          <w:numId w:val="1137"/>
         </w:numPr>
       </w:pPr>
       <w:r>
@@ -47898,7 +48442,7 @@
       <w:pPr>
         <w:numPr>
           <w:ilvl w:val="1"/>
-          <w:numId w:val="1124"/>
+          <w:numId w:val="1137"/>
         </w:numPr>
       </w:pPr>
       <w:r>
@@ -48339,7 +48883,7 @@
       <w:pPr>
         <w:numPr>
           <w:ilvl w:val="0"/>
-          <w:numId w:val="1125"/>
+          <w:numId w:val="1138"/>
         </w:numPr>
       </w:pPr>
       <w:r>
@@ -48548,7 +49092,7 @@
       <w:pPr>
         <w:numPr>
           <w:ilvl w:val="0"/>
-          <w:numId w:val="1126"/>
+          <w:numId w:val="1139"/>
         </w:numPr>
       </w:pPr>
       <w:r>
@@ -48710,9 +49254,10 @@
     </w:p>
     <w:p>
       <w:pPr>
+        <w:keepNext/>
         <w:numPr>
           <w:ilvl w:val="0"/>
-          <w:numId w:val="1127"/>
+          <w:numId w:val="1140"/>
         </w:numPr>
       </w:pPr>
       <w:r>
@@ -48760,7 +49305,18 @@
         <w:t xml:space="preserve">)</w:t>
       </w:r>
       <w:r>
-        <w:t xml:space="preserve">, hay 3 periodos (</w:t>
+        <w:t xml:space="preserve">:</w:t>
+      </w:r>
+    </w:p>
+    <w:p>
+      <w:pPr>
+        <w:numPr>
+          <w:ilvl w:val="1"/>
+          <w:numId w:val="1141"/>
+        </w:numPr>
+      </w:pPr>
+      <w:r>
+        <w:t xml:space="preserve">hay 3 periodos (</w:t>
       </w:r>
       <m:oMath>
         <m:r>
@@ -48815,7 +49371,18 @@
         </m:r>
       </m:oMath>
       <w:r>
-        <w:t xml:space="preserve">. Con probabilidad</w:t>
+        <w:t xml:space="preserve">;</w:t>
+      </w:r>
+    </w:p>
+    <w:p>
+      <w:pPr>
+        <w:numPr>
+          <w:ilvl w:val="1"/>
+          <w:numId w:val="1141"/>
+        </w:numPr>
+      </w:pPr>
+      <w:r>
+        <w:t xml:space="preserve">con probabilidad</w:t>
       </w:r>
       <w:r>
         <w:t xml:space="preserve"> </w:t>
@@ -48932,7 +49499,18 @@
         <w:t xml:space="preserve"> </w:t>
       </w:r>
       <w:r>
-        <w:t xml:space="preserve">será impaciente. Una inversión ilíquida rinde</w:t>
+        <w:t xml:space="preserve">será impaciente;</w:t>
+      </w:r>
+    </w:p>
+    <w:p>
+      <w:pPr>
+        <w:numPr>
+          <w:ilvl w:val="1"/>
+          <w:numId w:val="1141"/>
+        </w:numPr>
+      </w:pPr>
+      <w:r>
+        <w:t xml:space="preserve">una inversión ilíquida rinde</w:t>
       </w:r>
       <w:r>
         <w:t xml:space="preserve"> </w:t>
@@ -49018,7 +49596,18 @@
         </m:r>
       </m:oMath>
       <w:r>
-        <w:t xml:space="preserve">. Cada depositante maximiza su utilidad esperada, con</w:t>
+        <w:t xml:space="preserve">;</w:t>
+      </w:r>
+    </w:p>
+    <w:p>
+      <w:pPr>
+        <w:numPr>
+          <w:ilvl w:val="1"/>
+          <w:numId w:val="1141"/>
+        </w:numPr>
+      </w:pPr>
+      <w:r>
+        <w:t xml:space="preserve">cada depositante maximiza su utilidad esperada, con</w:t>
       </w:r>
       <w:r>
         <w:t xml:space="preserve"> </w:t>
@@ -49069,7 +49658,7 @@
       <w:pPr>
         <w:numPr>
           <w:ilvl w:val="0"/>
-          <w:numId w:val="1128"/>
+          <w:numId w:val="1142"/>
         </w:numPr>
       </w:pPr>
       <w:r>
@@ -49208,7 +49797,7 @@
       <w:pPr>
         <w:numPr>
           <w:ilvl w:val="0"/>
-          <w:numId w:val="1128"/>
+          <w:numId w:val="1142"/>
         </w:numPr>
       </w:pPr>
       <w:r>
@@ -49693,7 +50282,7 @@
       <w:pPr>
         <w:numPr>
           <w:ilvl w:val="0"/>
-          <w:numId w:val="1128"/>
+          <w:numId w:val="1142"/>
         </w:numPr>
       </w:pPr>
       <w:r>
@@ -49848,7 +50437,7 @@
         <w:keepNext/>
         <w:numPr>
           <w:ilvl w:val="0"/>
-          <w:numId w:val="1129"/>
+          <w:numId w:val="1143"/>
         </w:numPr>
       </w:pPr>
       <w:r>
@@ -49884,7 +50473,7 @@
       <w:pPr>
         <w:numPr>
           <w:ilvl w:val="1"/>
-          <w:numId w:val="1130"/>
+          <w:numId w:val="1144"/>
         </w:numPr>
       </w:pPr>
       <w:r>
@@ -49943,7 +50532,7 @@
       <w:pPr>
         <w:numPr>
           <w:ilvl w:val="1"/>
-          <w:numId w:val="1130"/>
+          <w:numId w:val="1144"/>
         </w:numPr>
       </w:pPr>
       <w:r>
@@ -49992,7 +50581,7 @@
       <w:pPr>
         <w:numPr>
           <w:ilvl w:val="0"/>
-          <w:numId w:val="1131"/>
+          <w:numId w:val="1145"/>
         </w:numPr>
       </w:pPr>
       <w:r>
@@ -50324,7 +50913,7 @@
         <w:keepNext/>
         <w:numPr>
           <w:ilvl w:val="0"/>
-          <w:numId w:val="1132"/>
+          <w:numId w:val="1146"/>
         </w:numPr>
       </w:pPr>
       <w:r>
@@ -50445,7 +51034,7 @@
       <w:pPr>
         <w:numPr>
           <w:ilvl w:val="1"/>
-          <w:numId w:val="1133"/>
+          <w:numId w:val="1147"/>
         </w:numPr>
       </w:pPr>
       <w:r>
@@ -50795,7 +51384,7 @@
       <w:pPr>
         <w:numPr>
           <w:ilvl w:val="1"/>
-          <w:numId w:val="1133"/>
+          <w:numId w:val="1147"/>
         </w:numPr>
       </w:pPr>
       <w:r>
@@ -50926,7 +51515,7 @@
       <w:pPr>
         <w:numPr>
           <w:ilvl w:val="0"/>
-          <w:numId w:val="1132"/>
+          <w:numId w:val="1146"/>
         </w:numPr>
       </w:pPr>
       <w:r>
@@ -50971,7 +51560,7 @@
       <w:pPr>
         <w:numPr>
           <w:ilvl w:val="0"/>
-          <w:numId w:val="1132"/>
+          <w:numId w:val="1146"/>
         </w:numPr>
       </w:pPr>
       <w:r>
@@ -51071,7 +51660,7 @@
       <w:pPr>
         <w:numPr>
           <w:ilvl w:val="0"/>
-          <w:numId w:val="1132"/>
+          <w:numId w:val="1146"/>
         </w:numPr>
       </w:pPr>
       <w:r>
@@ -51127,7 +51716,7 @@
       <w:pPr>
         <w:numPr>
           <w:ilvl w:val="0"/>
-          <w:numId w:val="1134"/>
+          <w:numId w:val="1148"/>
         </w:numPr>
       </w:pPr>
       <w:r>
@@ -51426,7 +52015,7 @@
       <w:pPr>
         <w:numPr>
           <w:ilvl w:val="0"/>
-          <w:numId w:val="1134"/>
+          <w:numId w:val="1148"/>
         </w:numPr>
       </w:pPr>
       <w:r>
@@ -51827,7 +52416,7 @@
       <w:pPr>
         <w:numPr>
           <w:ilvl w:val="0"/>
-          <w:numId w:val="1134"/>
+          <w:numId w:val="1148"/>
         </w:numPr>
       </w:pPr>
       <w:r>
@@ -52054,7 +52643,7 @@
       <w:pPr>
         <w:numPr>
           <w:ilvl w:val="0"/>
-          <w:numId w:val="1134"/>
+          <w:numId w:val="1148"/>
         </w:numPr>
       </w:pPr>
       <w:r>
@@ -52113,7 +52702,7 @@
       <w:pPr>
         <w:numPr>
           <w:ilvl w:val="0"/>
-          <w:numId w:val="1135"/>
+          <w:numId w:val="1149"/>
         </w:numPr>
       </w:pPr>
       <w:r>
@@ -52699,7 +53288,7 @@
       <w:pPr>
         <w:numPr>
           <w:ilvl w:val="0"/>
-          <w:numId w:val="1135"/>
+          <w:numId w:val="1149"/>
         </w:numPr>
       </w:pPr>
       <m:oMath>
@@ -52967,7 +53556,7 @@
       <w:pPr>
         <w:numPr>
           <w:ilvl w:val="0"/>
-          <w:numId w:val="1136"/>
+          <w:numId w:val="1150"/>
         </w:numPr>
       </w:pPr>
       <m:oMath>
@@ -54097,7 +54686,7 @@
       <w:pPr>
         <w:numPr>
           <w:ilvl w:val="0"/>
-          <w:numId w:val="1136"/>
+          <w:numId w:val="1150"/>
         </w:numPr>
       </w:pPr>
       <w:r>
@@ -54607,7 +55196,7 @@
       <w:pPr>
         <w:numPr>
           <w:ilvl w:val="0"/>
-          <w:numId w:val="1137"/>
+          <w:numId w:val="1151"/>
         </w:numPr>
       </w:pPr>
       <w:r>
@@ -55269,7 +55858,7 @@
       <w:pPr>
         <w:numPr>
           <w:ilvl w:val="0"/>
-          <w:numId w:val="1137"/>
+          <w:numId w:val="1151"/>
         </w:numPr>
       </w:pPr>
       <w:r>
@@ -55779,7 +56368,7 @@
       <w:pPr>
         <w:numPr>
           <w:ilvl w:val="0"/>
-          <w:numId w:val="1137"/>
+          <w:numId w:val="1151"/>
         </w:numPr>
       </w:pPr>
       <w:r>
@@ -56192,7 +56781,7 @@
       <w:pPr>
         <w:numPr>
           <w:ilvl w:val="0"/>
-          <w:numId w:val="1137"/>
+          <w:numId w:val="1151"/>
         </w:numPr>
       </w:pPr>
       <w:r>
@@ -56580,7 +57169,7 @@
       <w:pPr>
         <w:numPr>
           <w:ilvl w:val="0"/>
-          <w:numId w:val="1138"/>
+          <w:numId w:val="1152"/>
         </w:numPr>
       </w:pPr>
       <w:r>
@@ -57077,7 +57666,7 @@
       <w:pPr>
         <w:numPr>
           <w:ilvl w:val="0"/>
-          <w:numId w:val="1138"/>
+          <w:numId w:val="1152"/>
         </w:numPr>
       </w:pPr>
       <w:r>
@@ -57451,7 +58040,7 @@
       <w:pPr>
         <w:numPr>
           <w:ilvl w:val="0"/>
-          <w:numId w:val="1138"/>
+          <w:numId w:val="1152"/>
         </w:numPr>
       </w:pPr>
       <w:r>
@@ -57686,7 +58275,7 @@
       <w:pPr>
         <w:numPr>
           <w:ilvl w:val="0"/>
-          <w:numId w:val="1139"/>
+          <w:numId w:val="1153"/>
         </w:numPr>
       </w:pPr>
       <w:r>
@@ -58384,7 +58973,7 @@
       <w:pPr>
         <w:numPr>
           <w:ilvl w:val="0"/>
-          <w:numId w:val="1139"/>
+          <w:numId w:val="1153"/>
         </w:numPr>
       </w:pPr>
       <w:r>
@@ -58539,7 +59128,7 @@
       <w:pPr>
         <w:numPr>
           <w:ilvl w:val="0"/>
-          <w:numId w:val="1140"/>
+          <w:numId w:val="1154"/>
         </w:numPr>
       </w:pPr>
       <w:r>
@@ -58596,7 +59185,7 @@
         <w:keepNext/>
         <w:numPr>
           <w:ilvl w:val="0"/>
-          <w:numId w:val="1140"/>
+          <w:numId w:val="1154"/>
         </w:numPr>
       </w:pPr>
       <w:r>
@@ -58614,7 +59203,7 @@
       <w:pPr>
         <w:numPr>
           <w:ilvl w:val="1"/>
-          <w:numId w:val="1141"/>
+          <w:numId w:val="1155"/>
         </w:numPr>
       </w:pPr>
       <w:r>
@@ -58748,7 +59337,7 @@
       <w:pPr>
         <w:numPr>
           <w:ilvl w:val="1"/>
-          <w:numId w:val="1141"/>
+          <w:numId w:val="1155"/>
         </w:numPr>
       </w:pPr>
       <w:r>
@@ -58833,7 +59422,7 @@
         <w:keepNext/>
         <w:numPr>
           <w:ilvl w:val="0"/>
-          <w:numId w:val="1140"/>
+          <w:numId w:val="1154"/>
         </w:numPr>
       </w:pPr>
       <w:r>
@@ -58851,7 +59440,7 @@
       <w:pPr>
         <w:numPr>
           <w:ilvl w:val="1"/>
-          <w:numId w:val="1142"/>
+          <w:numId w:val="1156"/>
         </w:numPr>
       </w:pPr>
       <w:r>
@@ -58970,7 +59559,7 @@
       <w:pPr>
         <w:numPr>
           <w:ilvl w:val="1"/>
-          <w:numId w:val="1142"/>
+          <w:numId w:val="1156"/>
         </w:numPr>
       </w:pPr>
       <w:r>
@@ -59006,7 +59595,7 @@
       <w:pPr>
         <w:numPr>
           <w:ilvl w:val="1"/>
-          <w:numId w:val="1142"/>
+          <w:numId w:val="1156"/>
         </w:numPr>
       </w:pPr>
       <w:r>
@@ -59048,7 +59637,7 @@
       <w:pPr>
         <w:numPr>
           <w:ilvl w:val="1"/>
-          <w:numId w:val="1142"/>
+          <w:numId w:val="1156"/>
         </w:numPr>
       </w:pPr>
       <w:r>
@@ -59099,7 +59688,7 @@
       <w:pPr>
         <w:numPr>
           <w:ilvl w:val="1"/>
-          <w:numId w:val="1142"/>
+          <w:numId w:val="1156"/>
         </w:numPr>
       </w:pPr>
       <w:r>
@@ -59137,13 +59726,36 @@
     </w:p>
     <w:p>
       <w:pPr>
+        <w:keepNext/>
         <w:numPr>
           <w:ilvl w:val="1"/>
-          <w:numId w:val="1142"/>
+          <w:numId w:val="1156"/>
         </w:numPr>
       </w:pPr>
       <w:r>
-        <w:t xml:space="preserve">con prima justa el averso se asegura por completo; con prima recargada, en parte (</w:t>
+        <w:t xml:space="preserve">seguros:</w:t>
+      </w:r>
+    </w:p>
+    <w:p>
+      <w:pPr>
+        <w:numPr>
+          <w:ilvl w:val="2"/>
+          <w:numId w:val="1157"/>
+        </w:numPr>
+      </w:pPr>
+      <w:r>
+        <w:t xml:space="preserve">con prima justa el averso se asegura por completo;</w:t>
+      </w:r>
+    </w:p>
+    <w:p>
+      <w:pPr>
+        <w:numPr>
+          <w:ilvl w:val="2"/>
+          <w:numId w:val="1157"/>
+        </w:numPr>
+      </w:pPr>
+      <w:r>
+        <w:t xml:space="preserve">con prima recargada, en parte (</w:t>
       </w:r>
       <w:r>
         <w:rPr>
@@ -59152,7 +59764,18 @@
         <w:t xml:space="preserve">Mossin</w:t>
       </w:r>
       <w:r>
-        <w:t xml:space="preserve">); el modelo con información simétrica es el de</w:t>
+        <w:t xml:space="preserve">);</w:t>
+      </w:r>
+    </w:p>
+    <w:p>
+      <w:pPr>
+        <w:numPr>
+          <w:ilvl w:val="2"/>
+          <w:numId w:val="1157"/>
+        </w:numPr>
+      </w:pPr>
+      <w:r>
+        <w:t xml:space="preserve">el modelo con información simétrica es el de</w:t>
       </w:r>
       <w:r>
         <w:t xml:space="preserve"> </w:t>
@@ -59204,7 +59827,7 @@
       <w:pPr>
         <w:numPr>
           <w:ilvl w:val="1"/>
-          <w:numId w:val="1142"/>
+          <w:numId w:val="1156"/>
         </w:numPr>
       </w:pPr>
       <w:r>
@@ -59284,12 +59907,24 @@
     </w:p>
     <w:p>
       <w:pPr>
+        <w:keepNext/>
         <w:numPr>
           <w:ilvl w:val="1"/>
-          <w:numId w:val="1142"/>
+          <w:numId w:val="1156"/>
         </w:numPr>
       </w:pPr>
       <w:r>
+        <w:t xml:space="preserve">paradojas:</w:t>
+      </w:r>
+    </w:p>
+    <w:p>
+      <w:pPr>
+        <w:numPr>
+          <w:ilvl w:val="2"/>
+          <w:numId w:val="1158"/>
+        </w:numPr>
+      </w:pPr>
+      <w:r>
         <w:rPr>
           <w:smallCaps/>
         </w:rPr>
@@ -59301,9 +59936,14 @@
       <w:r>
         <w:t xml:space="preserve">viola el axioma de independencia;</w:t>
       </w:r>
-      <w:r>
-        <w:t xml:space="preserve"> </w:t>
-      </w:r>
+    </w:p>
+    <w:p>
+      <w:pPr>
+        <w:numPr>
+          <w:ilvl w:val="2"/>
+          <w:numId w:val="1158"/>
+        </w:numPr>
+      </w:pPr>
       <w:r>
         <w:rPr>
           <w:smallCaps/>
@@ -59313,9 +59953,14 @@
       <w:r>
         <w:t xml:space="preserve">, el principio de la cosa segura;</w:t>
       </w:r>
-      <w:r>
-        <w:t xml:space="preserve"> </w:t>
-      </w:r>
+    </w:p>
+    <w:p>
+      <w:pPr>
+        <w:numPr>
+          <w:ilvl w:val="2"/>
+          <w:numId w:val="1158"/>
+        </w:numPr>
+      </w:pPr>
       <w:r>
         <w:rPr>
           <w:smallCaps/>
@@ -59340,9 +59985,14 @@
       <w:r>
         <w:t xml:space="preserve">;</w:t>
       </w:r>
-      <w:r>
-        <w:t xml:space="preserve"> </w:t>
-      </w:r>
+    </w:p>
+    <w:p>
+      <w:pPr>
+        <w:numPr>
+          <w:ilvl w:val="2"/>
+          <w:numId w:val="1158"/>
+        </w:numPr>
+      </w:pPr>
       <w:r>
         <w:rPr>
           <w:smallCaps/>
@@ -59381,7 +60031,7 @@
       <w:pPr>
         <w:numPr>
           <w:ilvl w:val="1"/>
-          <w:numId w:val="1142"/>
+          <w:numId w:val="1156"/>
         </w:numPr>
       </w:pPr>
       <w:r>
@@ -59420,7 +60070,7 @@
       <w:pPr>
         <w:numPr>
           <w:ilvl w:val="1"/>
-          <w:numId w:val="1142"/>
+          <w:numId w:val="1156"/>
         </w:numPr>
       </w:pPr>
       <w:r>
@@ -65774,7 +66424,7 @@
         <w:pStyle w:val="FootnoteText"/>
         <w:numPr>
           <w:ilvl w:val="0"/>
-          <w:numId w:val="1029"/>
+          <w:numId w:val="1032"/>
         </w:numPr>
       </w:pPr>
       <w:r>
@@ -65945,7 +66595,7 @@
         <w:pStyle w:val="FootnoteText"/>
         <w:numPr>
           <w:ilvl w:val="0"/>
-          <w:numId w:val="1029"/>
+          <w:numId w:val="1032"/>
         </w:numPr>
       </w:pPr>
       <w:r>
@@ -66139,7 +66789,7 @@
         <w:pStyle w:val="FootnoteText"/>
         <w:numPr>
           <w:ilvl w:val="0"/>
-          <w:numId w:val="1029"/>
+          <w:numId w:val="1032"/>
         </w:numPr>
       </w:pPr>
       <w:r>
@@ -69957,6 +70607,15 @@
     <w:abstractNumId w:val="991"/>
   </w:num>
   <w:num w:numId="1011">
+    <w:abstractNumId w:val="991"/>
+  </w:num>
+  <w:num w:numId="1012">
+    <w:abstractNumId w:val="991"/>
+  </w:num>
+  <w:num w:numId="1013">
+    <w:abstractNumId w:val="991"/>
+  </w:num>
+  <w:num w:numId="1014">
     <w:abstractNumId w:val="99411"/>
     <w:lvlOverride w:ilvl="0">
       <w:startOverride w:val="1"/>
@@ -69986,15 +70645,6 @@
       <w:startOverride w:val="1"/>
     </w:lvlOverride>
   </w:num>
-  <w:num w:numId="1012">
-    <w:abstractNumId w:val="991"/>
-  </w:num>
-  <w:num w:numId="1013">
-    <w:abstractNumId w:val="991"/>
-  </w:num>
-  <w:num w:numId="1014">
-    <w:abstractNumId w:val="991"/>
-  </w:num>
   <w:num w:numId="1015">
     <w:abstractNumId w:val="991"/>
   </w:num>
@@ -70005,6 +70655,15 @@
     <w:abstractNumId w:val="991"/>
   </w:num>
   <w:num w:numId="1018">
+    <w:abstractNumId w:val="991"/>
+  </w:num>
+  <w:num w:numId="1019">
+    <w:abstractNumId w:val="991"/>
+  </w:num>
+  <w:num w:numId="1020">
+    <w:abstractNumId w:val="991"/>
+  </w:num>
+  <w:num w:numId="1021">
     <w:abstractNumId w:val="99411"/>
     <w:lvlOverride w:ilvl="0">
       <w:startOverride w:val="1"/>
@@ -70034,7 +70693,7 @@
       <w:startOverride w:val="1"/>
     </w:lvlOverride>
   </w:num>
-  <w:num w:numId="1019">
+  <w:num w:numId="1022">
     <w:abstractNumId w:val="99414"/>
     <w:lvlOverride w:ilvl="0">
       <w:startOverride w:val="4"/>
@@ -70063,15 +70722,6 @@
     <w:lvlOverride w:ilvl="8">
       <w:startOverride w:val="4"/>
     </w:lvlOverride>
-  </w:num>
-  <w:num w:numId="1020">
-    <w:abstractNumId w:val="991"/>
-  </w:num>
-  <w:num w:numId="1021">
-    <w:abstractNumId w:val="991"/>
-  </w:num>
-  <w:num w:numId="1022">
-    <w:abstractNumId w:val="991"/>
   </w:num>
   <w:num w:numId="1023">
     <w:abstractNumId w:val="991"/>
@@ -70107,6 +70757,18 @@
     <w:abstractNumId w:val="991"/>
   </w:num>
   <w:num w:numId="1034">
+    <w:abstractNumId w:val="991"/>
+  </w:num>
+  <w:num w:numId="1035">
+    <w:abstractNumId w:val="991"/>
+  </w:num>
+  <w:num w:numId="1036">
+    <w:abstractNumId w:val="991"/>
+  </w:num>
+  <w:num w:numId="1037">
+    <w:abstractNumId w:val="991"/>
+  </w:num>
+  <w:num w:numId="1038">
     <w:abstractNumId w:val="99411"/>
     <w:lvlOverride w:ilvl="0">
       <w:startOverride w:val="1"/>
@@ -70136,18 +70798,6 @@
       <w:startOverride w:val="1"/>
     </w:lvlOverride>
   </w:num>
-  <w:num w:numId="1035">
-    <w:abstractNumId w:val="991"/>
-  </w:num>
-  <w:num w:numId="1036">
-    <w:abstractNumId w:val="991"/>
-  </w:num>
-  <w:num w:numId="1037">
-    <w:abstractNumId w:val="991"/>
-  </w:num>
-  <w:num w:numId="1038">
-    <w:abstractNumId w:val="991"/>
-  </w:num>
   <w:num w:numId="1039">
     <w:abstractNumId w:val="991"/>
   </w:num>
@@ -70161,6 +70811,21 @@
     <w:abstractNumId w:val="991"/>
   </w:num>
   <w:num w:numId="1043">
+    <w:abstractNumId w:val="991"/>
+  </w:num>
+  <w:num w:numId="1044">
+    <w:abstractNumId w:val="991"/>
+  </w:num>
+  <w:num w:numId="1045">
+    <w:abstractNumId w:val="991"/>
+  </w:num>
+  <w:num w:numId="1046">
+    <w:abstractNumId w:val="991"/>
+  </w:num>
+  <w:num w:numId="1047">
+    <w:abstractNumId w:val="991"/>
+  </w:num>
+  <w:num w:numId="1048">
     <w:abstractNumId w:val="99411"/>
     <w:lvlOverride w:ilvl="0">
       <w:startOverride w:val="1"/>
@@ -70189,21 +70854,6 @@
     <w:lvlOverride w:ilvl="8">
       <w:startOverride w:val="1"/>
     </w:lvlOverride>
-  </w:num>
-  <w:num w:numId="1044">
-    <w:abstractNumId w:val="991"/>
-  </w:num>
-  <w:num w:numId="1045">
-    <w:abstractNumId w:val="991"/>
-  </w:num>
-  <w:num w:numId="1046">
-    <w:abstractNumId w:val="991"/>
-  </w:num>
-  <w:num w:numId="1047">
-    <w:abstractNumId w:val="991"/>
-  </w:num>
-  <w:num w:numId="1048">
-    <w:abstractNumId w:val="991"/>
   </w:num>
   <w:num w:numId="1049">
     <w:abstractNumId w:val="991"/>
@@ -70293,6 +70943,24 @@
     <w:abstractNumId w:val="991"/>
   </w:num>
   <w:num w:numId="1078">
+    <w:abstractNumId w:val="991"/>
+  </w:num>
+  <w:num w:numId="1079">
+    <w:abstractNumId w:val="991"/>
+  </w:num>
+  <w:num w:numId="1080">
+    <w:abstractNumId w:val="991"/>
+  </w:num>
+  <w:num w:numId="1081">
+    <w:abstractNumId w:val="991"/>
+  </w:num>
+  <w:num w:numId="1082">
+    <w:abstractNumId w:val="991"/>
+  </w:num>
+  <w:num w:numId="1083">
+    <w:abstractNumId w:val="991"/>
+  </w:num>
+  <w:num w:numId="1084">
     <w:abstractNumId w:val="99411"/>
     <w:lvlOverride w:ilvl="0">
       <w:startOverride w:val="1"/>
@@ -70321,24 +70989,6 @@
     <w:lvlOverride w:ilvl="8">
       <w:startOverride w:val="1"/>
     </w:lvlOverride>
-  </w:num>
-  <w:num w:numId="1079">
-    <w:abstractNumId w:val="991"/>
-  </w:num>
-  <w:num w:numId="1080">
-    <w:abstractNumId w:val="991"/>
-  </w:num>
-  <w:num w:numId="1081">
-    <w:abstractNumId w:val="991"/>
-  </w:num>
-  <w:num w:numId="1082">
-    <w:abstractNumId w:val="991"/>
-  </w:num>
-  <w:num w:numId="1083">
-    <w:abstractNumId w:val="991"/>
-  </w:num>
-  <w:num w:numId="1084">
-    <w:abstractNumId w:val="991"/>
   </w:num>
   <w:num w:numId="1085">
     <w:abstractNumId w:val="991"/>
@@ -70470,34 +71120,7 @@
     <w:abstractNumId w:val="991"/>
   </w:num>
   <w:num w:numId="1128">
-    <w:abstractNumId w:val="99411"/>
-    <w:lvlOverride w:ilvl="0">
-      <w:startOverride w:val="1"/>
-    </w:lvlOverride>
-    <w:lvlOverride w:ilvl="1">
-      <w:startOverride w:val="1"/>
-    </w:lvlOverride>
-    <w:lvlOverride w:ilvl="2">
-      <w:startOverride w:val="1"/>
-    </w:lvlOverride>
-    <w:lvlOverride w:ilvl="3">
-      <w:startOverride w:val="1"/>
-    </w:lvlOverride>
-    <w:lvlOverride w:ilvl="4">
-      <w:startOverride w:val="1"/>
-    </w:lvlOverride>
-    <w:lvlOverride w:ilvl="5">
-      <w:startOverride w:val="1"/>
-    </w:lvlOverride>
-    <w:lvlOverride w:ilvl="6">
-      <w:startOverride w:val="1"/>
-    </w:lvlOverride>
-    <w:lvlOverride w:ilvl="7">
-      <w:startOverride w:val="1"/>
-    </w:lvlOverride>
-    <w:lvlOverride w:ilvl="8">
-      <w:startOverride w:val="1"/>
-    </w:lvlOverride>
+    <w:abstractNumId w:val="991"/>
   </w:num>
   <w:num w:numId="1129">
     <w:abstractNumId w:val="991"/>
@@ -70539,6 +71162,81 @@
     <w:abstractNumId w:val="991"/>
   </w:num>
   <w:num w:numId="1142">
+    <w:abstractNumId w:val="99411"/>
+    <w:lvlOverride w:ilvl="0">
+      <w:startOverride w:val="1"/>
+    </w:lvlOverride>
+    <w:lvlOverride w:ilvl="1">
+      <w:startOverride w:val="1"/>
+    </w:lvlOverride>
+    <w:lvlOverride w:ilvl="2">
+      <w:startOverride w:val="1"/>
+    </w:lvlOverride>
+    <w:lvlOverride w:ilvl="3">
+      <w:startOverride w:val="1"/>
+    </w:lvlOverride>
+    <w:lvlOverride w:ilvl="4">
+      <w:startOverride w:val="1"/>
+    </w:lvlOverride>
+    <w:lvlOverride w:ilvl="5">
+      <w:startOverride w:val="1"/>
+    </w:lvlOverride>
+    <w:lvlOverride w:ilvl="6">
+      <w:startOverride w:val="1"/>
+    </w:lvlOverride>
+    <w:lvlOverride w:ilvl="7">
+      <w:startOverride w:val="1"/>
+    </w:lvlOverride>
+    <w:lvlOverride w:ilvl="8">
+      <w:startOverride w:val="1"/>
+    </w:lvlOverride>
+  </w:num>
+  <w:num w:numId="1143">
+    <w:abstractNumId w:val="991"/>
+  </w:num>
+  <w:num w:numId="1144">
+    <w:abstractNumId w:val="991"/>
+  </w:num>
+  <w:num w:numId="1145">
+    <w:abstractNumId w:val="991"/>
+  </w:num>
+  <w:num w:numId="1146">
+    <w:abstractNumId w:val="991"/>
+  </w:num>
+  <w:num w:numId="1147">
+    <w:abstractNumId w:val="991"/>
+  </w:num>
+  <w:num w:numId="1148">
+    <w:abstractNumId w:val="991"/>
+  </w:num>
+  <w:num w:numId="1149">
+    <w:abstractNumId w:val="991"/>
+  </w:num>
+  <w:num w:numId="1150">
+    <w:abstractNumId w:val="991"/>
+  </w:num>
+  <w:num w:numId="1151">
+    <w:abstractNumId w:val="991"/>
+  </w:num>
+  <w:num w:numId="1152">
+    <w:abstractNumId w:val="991"/>
+  </w:num>
+  <w:num w:numId="1153">
+    <w:abstractNumId w:val="991"/>
+  </w:num>
+  <w:num w:numId="1154">
+    <w:abstractNumId w:val="991"/>
+  </w:num>
+  <w:num w:numId="1155">
+    <w:abstractNumId w:val="991"/>
+  </w:num>
+  <w:num w:numId="1156">
+    <w:abstractNumId w:val="991"/>
+  </w:num>
+  <w:num w:numId="1157">
+    <w:abstractNumId w:val="991"/>
+  </w:num>
+  <w:num w:numId="1158">
     <w:abstractNumId w:val="991"/>
   </w:num>
 </w:numbering>

</xml_diff>